<commit_message>
refactoring of auth functions
</commit_message>
<xml_diff>
--- a/📘 ПОВНЕ ГЕНЕРАЛЬНЕ ТЕХНІЧНЕ ЗАВДАННЯ.docx
+++ b/📘 ПОВНЕ ГЕНЕРАЛЬНЕ ТЕХНІЧНЕ ЗАВДАННЯ.docx
@@ -1,6 +1,6 @@
 
 <file path=word/document.xml><?xml version="1.0" encoding="utf-8"?>
-<w:document xmlns:wpc="http://schemas.microsoft.com/office/word/2010/wordprocessingCanvas" xmlns:mc="http://schemas.openxmlformats.org/markup-compatibility/2006" xmlns:o="urn:schemas-microsoft-com:office:office" xmlns:r="http://schemas.openxmlformats.org/officeDocument/2006/relationships" xmlns:m="http://schemas.openxmlformats.org/officeDocument/2006/math" xmlns:v="urn:schemas-microsoft-com:vml" xmlns:wp14="http://schemas.microsoft.com/office/word/2010/wordprocessingDrawing" xmlns:wp="http://schemas.openxmlformats.org/drawingml/2006/wordprocessingDrawing" xmlns:w10="urn:schemas-microsoft-com:office:word" xmlns:w="http://schemas.openxmlformats.org/wordprocessingml/2006/main" xmlns:w14="http://schemas.microsoft.com/office/word/2010/wordml" xmlns:wpg="http://schemas.microsoft.com/office/word/2010/wordprocessingGroup" xmlns:wpi="http://schemas.microsoft.com/office/word/2010/wordprocessingInk" xmlns:wne="http://schemas.microsoft.com/office/word/2006/wordml" xmlns:wps="http://schemas.microsoft.com/office/word/2010/wordprocessingShape" mc:Ignorable="w14 wp14">
+<w:document xmlns:wpc="http://schemas.microsoft.com/office/word/2010/wordprocessingCanvas" xmlns:cx="http://schemas.microsoft.com/office/drawing/2014/chartex" xmlns:cx1="http://schemas.microsoft.com/office/drawing/2015/9/8/chartex" xmlns:cx2="http://schemas.microsoft.com/office/drawing/2015/10/21/chartex" xmlns:cx3="http://schemas.microsoft.com/office/drawing/2016/5/9/chartex" xmlns:cx4="http://schemas.microsoft.com/office/drawing/2016/5/10/chartex" xmlns:cx5="http://schemas.microsoft.com/office/drawing/2016/5/11/chartex" xmlns:cx6="http://schemas.microsoft.com/office/drawing/2016/5/12/chartex" xmlns:cx7="http://schemas.microsoft.com/office/drawing/2016/5/13/chartex" xmlns:cx8="http://schemas.microsoft.com/office/drawing/2016/5/14/chartex" xmlns:mc="http://schemas.openxmlformats.org/markup-compatibility/2006" xmlns:aink="http://schemas.microsoft.com/office/drawing/2016/ink" xmlns:am3d="http://schemas.microsoft.com/office/drawing/2017/model3d" xmlns:o="urn:schemas-microsoft-com:office:office" xmlns:r="http://schemas.openxmlformats.org/officeDocument/2006/relationships" xmlns:m="http://schemas.openxmlformats.org/officeDocument/2006/math" xmlns:v="urn:schemas-microsoft-com:vml" xmlns:wp14="http://schemas.microsoft.com/office/word/2010/wordprocessingDrawing" xmlns:wp="http://schemas.openxmlformats.org/drawingml/2006/wordprocessingDrawing" xmlns:w10="urn:schemas-microsoft-com:office:word" xmlns:w="http://schemas.openxmlformats.org/wordprocessingml/2006/main" xmlns:w14="http://schemas.microsoft.com/office/word/2010/wordml" xmlns:w15="http://schemas.microsoft.com/office/word/2012/wordml" xmlns:w16cex="http://schemas.microsoft.com/office/word/2018/wordml/cex" xmlns:w16cid="http://schemas.microsoft.com/office/word/2016/wordml/cid" xmlns:w16="http://schemas.microsoft.com/office/word/2018/wordml" xmlns:w16sdtdh="http://schemas.microsoft.com/office/word/2020/wordml/sdtdatahash" xmlns:w16se="http://schemas.microsoft.com/office/word/2015/wordml/symex" xmlns:wpg="http://schemas.microsoft.com/office/word/2010/wordprocessingGroup" xmlns:wpi="http://schemas.microsoft.com/office/word/2010/wordprocessingInk" xmlns:wne="http://schemas.microsoft.com/office/word/2006/wordml" xmlns:wps="http://schemas.microsoft.com/office/word/2010/wordprocessingShape" mc:Ignorable="w14 w15 w16se w16cid w16 w16cex w16sdtdh wp14">
   <w:body>
     <w:p>
       <w:pPr>
@@ -76,7 +76,7 @@
           <w:szCs w:val="24"/>
           <w:lang w:eastAsia="ru-RU"/>
         </w:rPr>
-        <w:pict>
+        <w:pict w14:anchorId="1CF3027A">
           <v:rect id="_x0000_i1025" style="width:0;height:1.5pt" o:hralign="center" o:hrstd="t" o:hr="t" fillcolor="#a0a0a0" stroked="f"/>
         </w:pict>
       </w:r>
@@ -384,7 +384,7 @@
           <w:szCs w:val="24"/>
           <w:lang w:eastAsia="ru-RU"/>
         </w:rPr>
-        <w:pict>
+        <w:pict w14:anchorId="31B2D62B">
           <v:rect id="_x0000_i1026" style="width:0;height:1.5pt" o:hralign="center" o:hrstd="t" o:hr="t" fillcolor="#a0a0a0" stroked="f"/>
         </w:pict>
       </w:r>
@@ -1452,7 +1452,7 @@
           <w:szCs w:val="24"/>
           <w:lang w:eastAsia="ru-RU"/>
         </w:rPr>
-        <w:pict>
+        <w:pict w14:anchorId="34CEECEA">
           <v:rect id="_x0000_i1027" style="width:0;height:1.5pt" o:hralign="center" o:hrstd="t" o:hr="t" fillcolor="#a0a0a0" stroked="f"/>
         </w:pict>
       </w:r>
@@ -1862,7 +1862,7 @@
           <w:szCs w:val="24"/>
           <w:lang w:eastAsia="ru-RU"/>
         </w:rPr>
-        <w:pict>
+        <w:pict w14:anchorId="016396D1">
           <v:rect id="_x0000_i1028" style="width:0;height:1.5pt" o:hralign="center" o:hrstd="t" o:hr="t" fillcolor="#a0a0a0" stroked="f"/>
         </w:pict>
       </w:r>
@@ -2142,7 +2142,7 @@
           <w:szCs w:val="24"/>
           <w:lang w:eastAsia="ru-RU"/>
         </w:rPr>
-        <w:pict>
+        <w:pict w14:anchorId="649D802D">
           <v:rect id="_x0000_i1029" style="width:0;height:1.5pt" o:hralign="center" o:hrstd="t" o:hr="t" fillcolor="#a0a0a0" stroked="f"/>
         </w:pict>
       </w:r>
@@ -2332,7 +2332,7 @@
           <w:szCs w:val="24"/>
           <w:lang w:eastAsia="ru-RU"/>
         </w:rPr>
-        <w:pict>
+        <w:pict w14:anchorId="094B3DA8">
           <v:rect id="_x0000_i1030" style="width:0;height:1.5pt" o:hralign="center" o:hrstd="t" o:hr="t" fillcolor="#a0a0a0" stroked="f"/>
         </w:pict>
       </w:r>
@@ -2683,7 +2683,7 @@
           <w:szCs w:val="24"/>
           <w:lang w:eastAsia="ru-RU"/>
         </w:rPr>
-        <w:pict>
+        <w:pict w14:anchorId="268905EA">
           <v:rect id="_x0000_i1031" style="width:0;height:1.5pt" o:hralign="center" o:hrstd="t" o:hr="t" fillcolor="#a0a0a0" stroked="f"/>
         </w:pict>
       </w:r>
@@ -3067,7 +3067,7 @@
           <w:szCs w:val="24"/>
           <w:lang w:eastAsia="ru-RU"/>
         </w:rPr>
-        <w:pict>
+        <w:pict w14:anchorId="71B4981A">
           <v:rect id="_x0000_i1032" style="width:0;height:1.5pt" o:hralign="center" o:hrstd="t" o:hr="t" fillcolor="#a0a0a0" stroked="f"/>
         </w:pict>
       </w:r>
@@ -3621,7 +3621,7 @@
           <w:szCs w:val="24"/>
           <w:lang w:eastAsia="ru-RU"/>
         </w:rPr>
-        <w:pict>
+        <w:pict w14:anchorId="383C2331">
           <v:rect id="_x0000_i1033" style="width:0;height:1.5pt" o:hralign="center" o:hrstd="t" o:hr="t" fillcolor="#a0a0a0" stroked="f"/>
         </w:pict>
       </w:r>
@@ -6886,7 +6886,7 @@
           <w:szCs w:val="24"/>
           <w:lang w:eastAsia="ru-RU"/>
         </w:rPr>
-        <w:pict>
+        <w:pict w14:anchorId="761EF17A">
           <v:rect id="_x0000_i1034" style="width:0;height:1.5pt" o:hralign="center" o:hrstd="t" o:hr="t" fillcolor="#a0a0a0" stroked="f"/>
         </w:pict>
       </w:r>
@@ -7553,7 +7553,7 @@
           <w:szCs w:val="24"/>
           <w:lang w:eastAsia="ru-RU"/>
         </w:rPr>
-        <w:pict>
+        <w:pict w14:anchorId="1C22DDFE">
           <v:rect id="_x0000_i1035" style="width:0;height:1.5pt" o:hralign="center" o:hrstd="t" o:hr="t" fillcolor="#a0a0a0" stroked="f"/>
         </w:pict>
       </w:r>
@@ -8041,7 +8041,7 @@
           <w:lang w:eastAsia="ru-RU"/>
         </w:rPr>
         <w:lastRenderedPageBreak/>
-        <w:pict>
+        <w:pict w14:anchorId="00AB18BE">
           <v:rect id="_x0000_i1036" style="width:0;height:1.5pt" o:hralign="center" o:hrstd="t" o:hr="t" fillcolor="#a0a0a0" stroked="f"/>
         </w:pict>
       </w:r>
@@ -8253,7 +8253,7 @@
           <w:szCs w:val="24"/>
           <w:lang w:eastAsia="ru-RU"/>
         </w:rPr>
-        <w:pict>
+        <w:pict w14:anchorId="3EE0DEBB">
           <v:rect id="_x0000_i1037" style="width:0;height:1.5pt" o:hralign="center" o:hrstd="t" o:hr="t" fillcolor="#a0a0a0" stroked="f"/>
         </w:pict>
       </w:r>
@@ -8588,10 +8588,546 @@
         <w:t>.</w:t>
       </w:r>
     </w:p>
-    <w:p>
-      <w:bookmarkStart w:id="0" w:name="_GoBack"/>
-      <w:bookmarkEnd w:id="0"/>
-    </w:p>
+    <w:p/>
+    <w:p/>
+    <w:p/>
+    <w:p/>
+    <w:p>
+      <w:pPr>
+        <w:spacing w:after="180" w:line="240" w:lineRule="auto"/>
+        <w:rPr>
+          <w:rFonts w:ascii="Arial" w:eastAsia="Times New Roman" w:hAnsi="Arial" w:cs="Arial"/>
+          <w:b/>
+          <w:bCs/>
+          <w:sz w:val="30"/>
+          <w:szCs w:val="30"/>
+          <w:lang w:val="uk-UA" w:eastAsia="uk-UA"/>
+        </w:rPr>
+      </w:pPr>
+      <w:r>
+        <w:rPr>
+          <w:rFonts w:ascii="Segoe UI Emoji" w:eastAsia="Times New Roman" w:hAnsi="Segoe UI Emoji" w:cs="Segoe UI Emoji"/>
+          <w:b/>
+          <w:bCs/>
+          <w:sz w:val="30"/>
+          <w:szCs w:val="30"/>
+          <w:lang w:val="uk-UA" w:eastAsia="uk-UA"/>
+        </w:rPr>
+        <w:t>📋</w:t>
+      </w:r>
+      <w:r>
+        <w:rPr>
+          <w:rFonts w:ascii="Arial" w:eastAsia="Times New Roman" w:hAnsi="Arial" w:cs="Arial"/>
+          <w:b/>
+          <w:bCs/>
+          <w:sz w:val="30"/>
+          <w:szCs w:val="30"/>
+          <w:lang w:val="uk-UA" w:eastAsia="uk-UA"/>
+        </w:rPr>
+        <w:t xml:space="preserve"> Варіант майбутньої сторінки тарифів (Пакетна логіка)</w:t>
+      </w:r>
+    </w:p>
+    <w:p>
+      <w:pPr>
+        <w:spacing w:line="240" w:lineRule="auto"/>
+        <w:rPr>
+          <w:rFonts w:ascii="Arial" w:eastAsia="Times New Roman" w:hAnsi="Arial" w:cs="Arial"/>
+          <w:sz w:val="24"/>
+          <w:szCs w:val="24"/>
+          <w:lang w:val="uk-UA" w:eastAsia="uk-UA"/>
+        </w:rPr>
+      </w:pPr>
+      <w:r>
+        <w:rPr>
+          <w:rFonts w:ascii="Arial" w:eastAsia="Times New Roman" w:hAnsi="Arial" w:cs="Arial"/>
+          <w:sz w:val="24"/>
+          <w:szCs w:val="24"/>
+          <w:lang w:val="uk-UA" w:eastAsia="uk-UA"/>
+        </w:rPr>
+        <w:t xml:space="preserve">Замість часових підписок «на місяць», ви пропонуєте людям купувати </w:t>
+      </w:r>
+      <w:r>
+        <w:rPr>
+          <w:rFonts w:ascii="Arial" w:eastAsia="Times New Roman" w:hAnsi="Arial" w:cs="Arial"/>
+          <w:b/>
+          <w:bCs/>
+          <w:sz w:val="24"/>
+          <w:szCs w:val="24"/>
+          <w:lang w:val="uk-UA" w:eastAsia="uk-UA"/>
+        </w:rPr>
+        <w:t>запас токенів/спроб, які ніколи не згоряють</w:t>
+      </w:r>
+      <w:r>
+        <w:rPr>
+          <w:rFonts w:ascii="Arial" w:eastAsia="Times New Roman" w:hAnsi="Arial" w:cs="Arial"/>
+          <w:sz w:val="24"/>
+          <w:szCs w:val="24"/>
+          <w:lang w:val="uk-UA" w:eastAsia="uk-UA"/>
+        </w:rPr>
+        <w:t xml:space="preserve"> [1.1]:</w:t>
+      </w:r>
+    </w:p>
+    <w:p>
+      <w:pPr>
+        <w:numPr>
+          <w:ilvl w:val="0"/>
+          <w:numId w:val="21"/>
+        </w:numPr>
+        <w:spacing w:after="0" w:line="240" w:lineRule="auto"/>
+        <w:rPr>
+          <w:rFonts w:ascii="Arial" w:eastAsia="Times New Roman" w:hAnsi="Arial" w:cs="Arial"/>
+          <w:sz w:val="24"/>
+          <w:szCs w:val="24"/>
+          <w:lang w:val="uk-UA" w:eastAsia="uk-UA"/>
+        </w:rPr>
+      </w:pPr>
+      <w:r>
+        <w:rPr>
+          <w:rFonts w:ascii="Arial" w:eastAsia="Times New Roman" w:hAnsi="Arial" w:cs="Arial"/>
+          <w:b/>
+          <w:bCs/>
+          <w:sz w:val="24"/>
+          <w:szCs w:val="24"/>
+          <w:lang w:val="uk-UA" w:eastAsia="uk-UA"/>
+        </w:rPr>
+        <w:t>Тариф «</w:t>
+      </w:r>
+      <w:r>
+        <w:rPr>
+          <w:rFonts w:ascii="Segoe UI Emoji" w:eastAsia="Times New Roman" w:hAnsi="Segoe UI Emoji" w:cs="Segoe UI Emoji"/>
+          <w:b/>
+          <w:bCs/>
+          <w:sz w:val="24"/>
+          <w:szCs w:val="24"/>
+          <w:lang w:val="uk-UA" w:eastAsia="uk-UA"/>
+        </w:rPr>
+        <w:t>🌱</w:t>
+      </w:r>
+      <w:r>
+        <w:rPr>
+          <w:rFonts w:ascii="Arial" w:eastAsia="Times New Roman" w:hAnsi="Arial" w:cs="Arial"/>
+          <w:b/>
+          <w:bCs/>
+          <w:sz w:val="24"/>
+          <w:szCs w:val="24"/>
+          <w:lang w:val="uk-UA" w:eastAsia="uk-UA"/>
+        </w:rPr>
+        <w:t xml:space="preserve"> Пробний Старт»</w:t>
+      </w:r>
+    </w:p>
+    <w:p>
+      <w:pPr>
+        <w:numPr>
+          <w:ilvl w:val="1"/>
+          <w:numId w:val="21"/>
+        </w:numPr>
+        <w:spacing w:after="0" w:line="240" w:lineRule="auto"/>
+        <w:rPr>
+          <w:rFonts w:ascii="Arial" w:eastAsia="Times New Roman" w:hAnsi="Arial" w:cs="Arial"/>
+          <w:sz w:val="24"/>
+          <w:szCs w:val="24"/>
+          <w:lang w:val="uk-UA" w:eastAsia="uk-UA"/>
+        </w:rPr>
+      </w:pPr>
+      <w:r>
+        <w:rPr>
+          <w:rFonts w:ascii="Arial" w:eastAsia="Times New Roman" w:hAnsi="Arial" w:cs="Arial"/>
+          <w:b/>
+          <w:bCs/>
+          <w:sz w:val="24"/>
+          <w:szCs w:val="24"/>
+          <w:lang w:val="uk-UA" w:eastAsia="uk-UA"/>
+        </w:rPr>
+        <w:t>Що всередині:</w:t>
+      </w:r>
+      <w:r>
+        <w:rPr>
+          <w:rFonts w:ascii="Arial" w:eastAsia="Times New Roman" w:hAnsi="Arial" w:cs="Arial"/>
+          <w:sz w:val="24"/>
+          <w:szCs w:val="24"/>
+          <w:lang w:val="uk-UA" w:eastAsia="uk-UA"/>
+        </w:rPr>
+        <w:t xml:space="preserve"> 20 повних адаптацій матеріалів НУШ.</w:t>
+      </w:r>
+    </w:p>
+    <w:p>
+      <w:pPr>
+        <w:numPr>
+          <w:ilvl w:val="1"/>
+          <w:numId w:val="21"/>
+        </w:numPr>
+        <w:spacing w:after="0" w:line="240" w:lineRule="auto"/>
+        <w:rPr>
+          <w:rFonts w:ascii="Arial" w:eastAsia="Times New Roman" w:hAnsi="Arial" w:cs="Arial"/>
+          <w:sz w:val="24"/>
+          <w:szCs w:val="24"/>
+          <w:lang w:val="uk-UA" w:eastAsia="uk-UA"/>
+        </w:rPr>
+      </w:pPr>
+      <w:r>
+        <w:rPr>
+          <w:rFonts w:ascii="Arial" w:eastAsia="Times New Roman" w:hAnsi="Arial" w:cs="Arial"/>
+          <w:b/>
+          <w:bCs/>
+          <w:sz w:val="24"/>
+          <w:szCs w:val="24"/>
+          <w:lang w:val="uk-UA" w:eastAsia="uk-UA"/>
+        </w:rPr>
+        <w:lastRenderedPageBreak/>
+        <w:t>Термін дії:</w:t>
+      </w:r>
+      <w:r>
+        <w:rPr>
+          <w:rFonts w:ascii="Arial" w:eastAsia="Times New Roman" w:hAnsi="Arial" w:cs="Arial"/>
+          <w:sz w:val="24"/>
+          <w:szCs w:val="24"/>
+          <w:lang w:val="uk-UA" w:eastAsia="uk-UA"/>
+        </w:rPr>
+        <w:t xml:space="preserve"> Безлімітний за часом (пакет активний, поки не закінчаться спроби).</w:t>
+      </w:r>
+    </w:p>
+    <w:p>
+      <w:pPr>
+        <w:numPr>
+          <w:ilvl w:val="1"/>
+          <w:numId w:val="21"/>
+        </w:numPr>
+        <w:spacing w:after="0" w:line="240" w:lineRule="auto"/>
+        <w:rPr>
+          <w:rFonts w:ascii="Arial" w:eastAsia="Times New Roman" w:hAnsi="Arial" w:cs="Arial"/>
+          <w:sz w:val="24"/>
+          <w:szCs w:val="24"/>
+          <w:lang w:val="uk-UA" w:eastAsia="uk-UA"/>
+        </w:rPr>
+      </w:pPr>
+      <w:r>
+        <w:rPr>
+          <w:rFonts w:ascii="Arial" w:eastAsia="Times New Roman" w:hAnsi="Arial" w:cs="Arial"/>
+          <w:b/>
+          <w:bCs/>
+          <w:sz w:val="24"/>
+          <w:szCs w:val="24"/>
+          <w:lang w:val="uk-UA" w:eastAsia="uk-UA"/>
+        </w:rPr>
+        <w:t>Для кого:</w:t>
+      </w:r>
+      <w:r>
+        <w:rPr>
+          <w:rFonts w:ascii="Arial" w:eastAsia="Times New Roman" w:hAnsi="Arial" w:cs="Arial"/>
+          <w:sz w:val="24"/>
+          <w:szCs w:val="24"/>
+          <w:lang w:val="uk-UA" w:eastAsia="uk-UA"/>
+        </w:rPr>
+        <w:t xml:space="preserve"> Для тих, хто хоче спробувати сервіс під час окремих складних тем.</w:t>
+      </w:r>
+    </w:p>
+    <w:p>
+      <w:pPr>
+        <w:numPr>
+          <w:ilvl w:val="0"/>
+          <w:numId w:val="21"/>
+        </w:numPr>
+        <w:spacing w:after="0" w:line="240" w:lineRule="auto"/>
+        <w:rPr>
+          <w:rFonts w:ascii="Arial" w:eastAsia="Times New Roman" w:hAnsi="Arial" w:cs="Arial"/>
+          <w:sz w:val="24"/>
+          <w:szCs w:val="24"/>
+          <w:lang w:val="uk-UA" w:eastAsia="uk-UA"/>
+        </w:rPr>
+      </w:pPr>
+      <w:r>
+        <w:rPr>
+          <w:rFonts w:ascii="Arial" w:eastAsia="Times New Roman" w:hAnsi="Arial" w:cs="Arial"/>
+          <w:b/>
+          <w:bCs/>
+          <w:sz w:val="24"/>
+          <w:szCs w:val="24"/>
+          <w:lang w:val="uk-UA" w:eastAsia="uk-UA"/>
+        </w:rPr>
+        <w:t>Тариф «</w:t>
+      </w:r>
+      <w:r>
+        <w:rPr>
+          <w:rFonts w:ascii="Segoe UI Emoji" w:eastAsia="Times New Roman" w:hAnsi="Segoe UI Emoji" w:cs="Segoe UI Emoji"/>
+          <w:b/>
+          <w:bCs/>
+          <w:sz w:val="24"/>
+          <w:szCs w:val="24"/>
+          <w:lang w:val="uk-UA" w:eastAsia="uk-UA"/>
+        </w:rPr>
+        <w:t>🎯</w:t>
+      </w:r>
+      <w:r>
+        <w:rPr>
+          <w:rFonts w:ascii="Arial" w:eastAsia="Times New Roman" w:hAnsi="Arial" w:cs="Arial"/>
+          <w:b/>
+          <w:bCs/>
+          <w:sz w:val="24"/>
+          <w:szCs w:val="24"/>
+          <w:lang w:val="uk-UA" w:eastAsia="uk-UA"/>
+        </w:rPr>
+        <w:t xml:space="preserve"> Шкільний марафон»</w:t>
+      </w:r>
+    </w:p>
+    <w:p>
+      <w:pPr>
+        <w:numPr>
+          <w:ilvl w:val="1"/>
+          <w:numId w:val="21"/>
+        </w:numPr>
+        <w:spacing w:after="0" w:line="240" w:lineRule="auto"/>
+        <w:rPr>
+          <w:rFonts w:ascii="Arial" w:eastAsia="Times New Roman" w:hAnsi="Arial" w:cs="Arial"/>
+          <w:sz w:val="24"/>
+          <w:szCs w:val="24"/>
+          <w:lang w:val="uk-UA" w:eastAsia="uk-UA"/>
+        </w:rPr>
+      </w:pPr>
+      <w:r>
+        <w:rPr>
+          <w:rFonts w:ascii="Arial" w:eastAsia="Times New Roman" w:hAnsi="Arial" w:cs="Arial"/>
+          <w:b/>
+          <w:bCs/>
+          <w:sz w:val="24"/>
+          <w:szCs w:val="24"/>
+          <w:lang w:val="uk-UA" w:eastAsia="uk-UA"/>
+        </w:rPr>
+        <w:t>Що всередині:</w:t>
+      </w:r>
+      <w:r>
+        <w:rPr>
+          <w:rFonts w:ascii="Arial" w:eastAsia="Times New Roman" w:hAnsi="Arial" w:cs="Arial"/>
+          <w:sz w:val="24"/>
+          <w:szCs w:val="24"/>
+          <w:lang w:val="uk-UA" w:eastAsia="uk-UA"/>
+        </w:rPr>
+        <w:t xml:space="preserve"> 100 повних адаптацій матеріалів НУШ.</w:t>
+      </w:r>
+    </w:p>
+    <w:p>
+      <w:pPr>
+        <w:numPr>
+          <w:ilvl w:val="1"/>
+          <w:numId w:val="21"/>
+        </w:numPr>
+        <w:spacing w:after="0" w:line="240" w:lineRule="auto"/>
+        <w:rPr>
+          <w:rFonts w:ascii="Arial" w:eastAsia="Times New Roman" w:hAnsi="Arial" w:cs="Arial"/>
+          <w:sz w:val="24"/>
+          <w:szCs w:val="24"/>
+          <w:lang w:val="uk-UA" w:eastAsia="uk-UA"/>
+        </w:rPr>
+      </w:pPr>
+      <w:r>
+        <w:rPr>
+          <w:rFonts w:ascii="Arial" w:eastAsia="Times New Roman" w:hAnsi="Arial" w:cs="Arial"/>
+          <w:b/>
+          <w:bCs/>
+          <w:sz w:val="24"/>
+          <w:szCs w:val="24"/>
+          <w:lang w:val="uk-UA" w:eastAsia="uk-UA"/>
+        </w:rPr>
+        <w:t>Термін дії:</w:t>
+      </w:r>
+      <w:r>
+        <w:rPr>
+          <w:rFonts w:ascii="Arial" w:eastAsia="Times New Roman" w:hAnsi="Arial" w:cs="Arial"/>
+          <w:sz w:val="24"/>
+          <w:szCs w:val="24"/>
+          <w:lang w:val="uk-UA" w:eastAsia="uk-UA"/>
+        </w:rPr>
+        <w:t xml:space="preserve"> Безлімітний за часом (якщо дитина захворіла — спроби просто чекають її повернення).</w:t>
+      </w:r>
+    </w:p>
+    <w:p>
+      <w:pPr>
+        <w:numPr>
+          <w:ilvl w:val="1"/>
+          <w:numId w:val="21"/>
+        </w:numPr>
+        <w:spacing w:after="0" w:line="240" w:lineRule="auto"/>
+        <w:rPr>
+          <w:rFonts w:ascii="Arial" w:eastAsia="Times New Roman" w:hAnsi="Arial" w:cs="Arial"/>
+          <w:sz w:val="24"/>
+          <w:szCs w:val="24"/>
+          <w:lang w:val="uk-UA" w:eastAsia="uk-UA"/>
+        </w:rPr>
+      </w:pPr>
+      <w:r>
+        <w:rPr>
+          <w:rFonts w:ascii="Arial" w:eastAsia="Times New Roman" w:hAnsi="Arial" w:cs="Arial"/>
+          <w:b/>
+          <w:bCs/>
+          <w:sz w:val="24"/>
+          <w:szCs w:val="24"/>
+          <w:lang w:val="uk-UA" w:eastAsia="uk-UA"/>
+        </w:rPr>
+        <w:t>Для кого:</w:t>
+      </w:r>
+      <w:r>
+        <w:rPr>
+          <w:rFonts w:ascii="Arial" w:eastAsia="Times New Roman" w:hAnsi="Arial" w:cs="Arial"/>
+          <w:sz w:val="24"/>
+          <w:szCs w:val="24"/>
+          <w:lang w:val="uk-UA" w:eastAsia="uk-UA"/>
+        </w:rPr>
+        <w:t xml:space="preserve"> Найпопулярніший варіант для мам на домашньому навчанні або асистентів вчителів.</w:t>
+      </w:r>
+    </w:p>
+    <w:p>
+      <w:pPr>
+        <w:numPr>
+          <w:ilvl w:val="0"/>
+          <w:numId w:val="21"/>
+        </w:numPr>
+        <w:spacing w:after="0" w:line="240" w:lineRule="auto"/>
+        <w:rPr>
+          <w:rFonts w:ascii="Arial" w:eastAsia="Times New Roman" w:hAnsi="Arial" w:cs="Arial"/>
+          <w:sz w:val="24"/>
+          <w:szCs w:val="24"/>
+          <w:lang w:val="uk-UA" w:eastAsia="uk-UA"/>
+        </w:rPr>
+      </w:pPr>
+      <w:r>
+        <w:rPr>
+          <w:rFonts w:ascii="Arial" w:eastAsia="Times New Roman" w:hAnsi="Arial" w:cs="Arial"/>
+          <w:b/>
+          <w:bCs/>
+          <w:sz w:val="24"/>
+          <w:szCs w:val="24"/>
+          <w:lang w:val="uk-UA" w:eastAsia="uk-UA"/>
+        </w:rPr>
+        <w:t>Тариф «</w:t>
+      </w:r>
+      <w:r>
+        <w:rPr>
+          <w:rFonts w:ascii="Segoe UI Emoji" w:eastAsia="Times New Roman" w:hAnsi="Segoe UI Emoji" w:cs="Segoe UI Emoji"/>
+          <w:b/>
+          <w:bCs/>
+          <w:sz w:val="24"/>
+          <w:szCs w:val="24"/>
+          <w:lang w:val="uk-UA" w:eastAsia="uk-UA"/>
+        </w:rPr>
+        <w:t>🏫</w:t>
+      </w:r>
+      <w:r>
+        <w:rPr>
+          <w:rFonts w:ascii="Arial" w:eastAsia="Times New Roman" w:hAnsi="Arial" w:cs="Arial"/>
+          <w:b/>
+          <w:bCs/>
+          <w:sz w:val="24"/>
+          <w:szCs w:val="24"/>
+          <w:lang w:val="uk-UA" w:eastAsia="uk-UA"/>
+        </w:rPr>
+        <w:t xml:space="preserve"> Професійний (Для педагогів)»</w:t>
+      </w:r>
+    </w:p>
+    <w:p>
+      <w:pPr>
+        <w:numPr>
+          <w:ilvl w:val="1"/>
+          <w:numId w:val="21"/>
+        </w:numPr>
+        <w:spacing w:after="0" w:line="240" w:lineRule="auto"/>
+        <w:rPr>
+          <w:rFonts w:ascii="Arial" w:eastAsia="Times New Roman" w:hAnsi="Arial" w:cs="Arial"/>
+          <w:sz w:val="24"/>
+          <w:szCs w:val="24"/>
+          <w:lang w:val="uk-UA" w:eastAsia="uk-UA"/>
+        </w:rPr>
+      </w:pPr>
+      <w:r>
+        <w:rPr>
+          <w:rFonts w:ascii="Arial" w:eastAsia="Times New Roman" w:hAnsi="Arial" w:cs="Arial"/>
+          <w:b/>
+          <w:bCs/>
+          <w:sz w:val="24"/>
+          <w:szCs w:val="24"/>
+          <w:lang w:val="uk-UA" w:eastAsia="uk-UA"/>
+        </w:rPr>
+        <w:t>Що всередині:</w:t>
+      </w:r>
+      <w:r>
+        <w:rPr>
+          <w:rFonts w:ascii="Arial" w:eastAsia="Times New Roman" w:hAnsi="Arial" w:cs="Arial"/>
+          <w:sz w:val="24"/>
+          <w:szCs w:val="24"/>
+          <w:lang w:val="uk-UA" w:eastAsia="uk-UA"/>
+        </w:rPr>
+        <w:t xml:space="preserve"> 300 повних адаптацій матеріалів.</w:t>
+      </w:r>
+    </w:p>
+    <w:p>
+      <w:pPr>
+        <w:numPr>
+          <w:ilvl w:val="1"/>
+          <w:numId w:val="21"/>
+        </w:numPr>
+        <w:spacing w:after="0" w:line="240" w:lineRule="auto"/>
+        <w:rPr>
+          <w:rFonts w:ascii="Arial" w:eastAsia="Times New Roman" w:hAnsi="Arial" w:cs="Arial"/>
+          <w:sz w:val="24"/>
+          <w:szCs w:val="24"/>
+          <w:lang w:val="uk-UA" w:eastAsia="uk-UA"/>
+        </w:rPr>
+      </w:pPr>
+      <w:r>
+        <w:rPr>
+          <w:rFonts w:ascii="Arial" w:eastAsia="Times New Roman" w:hAnsi="Arial" w:cs="Arial"/>
+          <w:b/>
+          <w:bCs/>
+          <w:sz w:val="24"/>
+          <w:szCs w:val="24"/>
+          <w:lang w:val="uk-UA" w:eastAsia="uk-UA"/>
+        </w:rPr>
+        <w:t>Термін дії:</w:t>
+      </w:r>
+      <w:r>
+        <w:rPr>
+          <w:rFonts w:ascii="Arial" w:eastAsia="Times New Roman" w:hAnsi="Arial" w:cs="Arial"/>
+          <w:sz w:val="24"/>
+          <w:szCs w:val="24"/>
+          <w:lang w:val="uk-UA" w:eastAsia="uk-UA"/>
+        </w:rPr>
+        <w:t xml:space="preserve"> Безлімітний за часом.</w:t>
+      </w:r>
+    </w:p>
+    <w:p>
+      <w:pPr>
+        <w:numPr>
+          <w:ilvl w:val="1"/>
+          <w:numId w:val="21"/>
+        </w:numPr>
+        <w:spacing w:after="0" w:line="240" w:lineRule="auto"/>
+        <w:rPr>
+          <w:rFonts w:ascii="Arial" w:eastAsia="Times New Roman" w:hAnsi="Arial" w:cs="Arial"/>
+          <w:sz w:val="24"/>
+          <w:szCs w:val="24"/>
+          <w:lang w:val="uk-UA" w:eastAsia="uk-UA"/>
+        </w:rPr>
+      </w:pPr>
+      <w:r>
+        <w:rPr>
+          <w:rFonts w:ascii="Arial" w:eastAsia="Times New Roman" w:hAnsi="Arial" w:cs="Arial"/>
+          <w:b/>
+          <w:bCs/>
+          <w:sz w:val="24"/>
+          <w:szCs w:val="24"/>
+          <w:lang w:val="uk-UA" w:eastAsia="uk-UA"/>
+        </w:rPr>
+        <w:t>Для кого:</w:t>
+      </w:r>
+      <w:r>
+        <w:rPr>
+          <w:rFonts w:ascii="Arial" w:eastAsia="Times New Roman" w:hAnsi="Arial" w:cs="Arial"/>
+          <w:sz w:val="24"/>
+          <w:szCs w:val="24"/>
+          <w:lang w:val="uk-UA" w:eastAsia="uk-UA"/>
+        </w:rPr>
+        <w:t xml:space="preserve"> Для вчителів-інклюзивістів, у яких в класі одразу кілька дітей з ООП.</w:t>
+      </w:r>
+    </w:p>
+    <w:p/>
     <w:sectPr>
       <w:pgSz w:w="11906" w:h="16838"/>
       <w:pgMar w:top="1134" w:right="850" w:bottom="1134" w:left="1701" w:header="708" w:footer="708" w:gutter="0"/>
@@ -8603,8 +9139,157 @@
 </file>
 
 <file path=word/numbering.xml><?xml version="1.0" encoding="utf-8"?>
-<w:numbering xmlns:wpc="http://schemas.microsoft.com/office/word/2010/wordprocessingCanvas" xmlns:mc="http://schemas.openxmlformats.org/markup-compatibility/2006" xmlns:o="urn:schemas-microsoft-com:office:office" xmlns:r="http://schemas.openxmlformats.org/officeDocument/2006/relationships" xmlns:m="http://schemas.openxmlformats.org/officeDocument/2006/math" xmlns:v="urn:schemas-microsoft-com:vml" xmlns:wp14="http://schemas.microsoft.com/office/word/2010/wordprocessingDrawing" xmlns:wp="http://schemas.openxmlformats.org/drawingml/2006/wordprocessingDrawing" xmlns:w10="urn:schemas-microsoft-com:office:word" xmlns:w="http://schemas.openxmlformats.org/wordprocessingml/2006/main" xmlns:w14="http://schemas.microsoft.com/office/word/2010/wordml" xmlns:wpg="http://schemas.microsoft.com/office/word/2010/wordprocessingGroup" xmlns:wpi="http://schemas.microsoft.com/office/word/2010/wordprocessingInk" xmlns:wne="http://schemas.microsoft.com/office/word/2006/wordml" xmlns:wps="http://schemas.microsoft.com/office/word/2010/wordprocessingShape" mc:Ignorable="w14 wp14">
-  <w:abstractNum w:abstractNumId="0">
+<w:numbering xmlns:wpc="http://schemas.microsoft.com/office/word/2010/wordprocessingCanvas" xmlns:cx="http://schemas.microsoft.com/office/drawing/2014/chartex" xmlns:cx1="http://schemas.microsoft.com/office/drawing/2015/9/8/chartex" xmlns:cx2="http://schemas.microsoft.com/office/drawing/2015/10/21/chartex" xmlns:cx3="http://schemas.microsoft.com/office/drawing/2016/5/9/chartex" xmlns:cx4="http://schemas.microsoft.com/office/drawing/2016/5/10/chartex" xmlns:cx5="http://schemas.microsoft.com/office/drawing/2016/5/11/chartex" xmlns:cx6="http://schemas.microsoft.com/office/drawing/2016/5/12/chartex" xmlns:cx7="http://schemas.microsoft.com/office/drawing/2016/5/13/chartex" xmlns:cx8="http://schemas.microsoft.com/office/drawing/2016/5/14/chartex" xmlns:mc="http://schemas.openxmlformats.org/markup-compatibility/2006" xmlns:aink="http://schemas.microsoft.com/office/drawing/2016/ink" xmlns:am3d="http://schemas.microsoft.com/office/drawing/2017/model3d" xmlns:o="urn:schemas-microsoft-com:office:office" xmlns:r="http://schemas.openxmlformats.org/officeDocument/2006/relationships" xmlns:m="http://schemas.openxmlformats.org/officeDocument/2006/math" xmlns:v="urn:schemas-microsoft-com:vml" xmlns:wp14="http://schemas.microsoft.com/office/word/2010/wordprocessingDrawing" xmlns:wp="http://schemas.openxmlformats.org/drawingml/2006/wordprocessingDrawing" xmlns:w10="urn:schemas-microsoft-com:office:word" xmlns:w="http://schemas.openxmlformats.org/wordprocessingml/2006/main" xmlns:w14="http://schemas.microsoft.com/office/word/2010/wordml" xmlns:w15="http://schemas.microsoft.com/office/word/2012/wordml" xmlns:w16cex="http://schemas.microsoft.com/office/word/2018/wordml/cex" xmlns:w16cid="http://schemas.microsoft.com/office/word/2016/wordml/cid" xmlns:w16="http://schemas.microsoft.com/office/word/2018/wordml" xmlns:w16sdtdh="http://schemas.microsoft.com/office/word/2020/wordml/sdtdatahash" xmlns:w16se="http://schemas.microsoft.com/office/word/2015/wordml/symex" xmlns:wpg="http://schemas.microsoft.com/office/word/2010/wordprocessingGroup" xmlns:wpi="http://schemas.microsoft.com/office/word/2010/wordprocessingInk" xmlns:wne="http://schemas.microsoft.com/office/word/2006/wordml" xmlns:wps="http://schemas.microsoft.com/office/word/2010/wordprocessingShape" mc:Ignorable="w14 w15 w16se w16cid w16 w16cex w16sdtdh wp14">
+  <w:abstractNum w:abstractNumId="0" w15:restartNumberingAfterBreak="0">
+    <w:nsid w:val="03F343A0"/>
+    <w:multiLevelType w:val="multilevel"/>
+    <w:tmpl w:val="3BC4468E"/>
+    <w:lvl w:ilvl="0">
+      <w:start w:val="1"/>
+      <w:numFmt w:val="bullet"/>
+      <w:lvlText w:val=""/>
+      <w:lvlJc w:val="left"/>
+      <w:pPr>
+        <w:tabs>
+          <w:tab w:val="num" w:pos="720"/>
+        </w:tabs>
+        <w:ind w:left="720" w:hanging="360"/>
+      </w:pPr>
+      <w:rPr>
+        <w:rFonts w:ascii="Symbol" w:hAnsi="Symbol" w:hint="default"/>
+        <w:sz w:val="20"/>
+      </w:rPr>
+    </w:lvl>
+    <w:lvl w:ilvl="1">
+      <w:start w:val="1"/>
+      <w:numFmt w:val="bullet"/>
+      <w:lvlText w:val="o"/>
+      <w:lvlJc w:val="left"/>
+      <w:pPr>
+        <w:tabs>
+          <w:tab w:val="num" w:pos="1440"/>
+        </w:tabs>
+        <w:ind w:left="1440" w:hanging="360"/>
+      </w:pPr>
+      <w:rPr>
+        <w:rFonts w:ascii="Courier New" w:hAnsi="Courier New" w:hint="default"/>
+        <w:sz w:val="20"/>
+      </w:rPr>
+    </w:lvl>
+    <w:lvl w:ilvl="2" w:tentative="1">
+      <w:start w:val="1"/>
+      <w:numFmt w:val="bullet"/>
+      <w:lvlText w:val=""/>
+      <w:lvlJc w:val="left"/>
+      <w:pPr>
+        <w:tabs>
+          <w:tab w:val="num" w:pos="2160"/>
+        </w:tabs>
+        <w:ind w:left="2160" w:hanging="360"/>
+      </w:pPr>
+      <w:rPr>
+        <w:rFonts w:ascii="Wingdings" w:hAnsi="Wingdings" w:hint="default"/>
+        <w:sz w:val="20"/>
+      </w:rPr>
+    </w:lvl>
+    <w:lvl w:ilvl="3" w:tentative="1">
+      <w:start w:val="1"/>
+      <w:numFmt w:val="bullet"/>
+      <w:lvlText w:val=""/>
+      <w:lvlJc w:val="left"/>
+      <w:pPr>
+        <w:tabs>
+          <w:tab w:val="num" w:pos="2880"/>
+        </w:tabs>
+        <w:ind w:left="2880" w:hanging="360"/>
+      </w:pPr>
+      <w:rPr>
+        <w:rFonts w:ascii="Wingdings" w:hAnsi="Wingdings" w:hint="default"/>
+        <w:sz w:val="20"/>
+      </w:rPr>
+    </w:lvl>
+    <w:lvl w:ilvl="4" w:tentative="1">
+      <w:start w:val="1"/>
+      <w:numFmt w:val="bullet"/>
+      <w:lvlText w:val=""/>
+      <w:lvlJc w:val="left"/>
+      <w:pPr>
+        <w:tabs>
+          <w:tab w:val="num" w:pos="3600"/>
+        </w:tabs>
+        <w:ind w:left="3600" w:hanging="360"/>
+      </w:pPr>
+      <w:rPr>
+        <w:rFonts w:ascii="Wingdings" w:hAnsi="Wingdings" w:hint="default"/>
+        <w:sz w:val="20"/>
+      </w:rPr>
+    </w:lvl>
+    <w:lvl w:ilvl="5" w:tentative="1">
+      <w:start w:val="1"/>
+      <w:numFmt w:val="bullet"/>
+      <w:lvlText w:val=""/>
+      <w:lvlJc w:val="left"/>
+      <w:pPr>
+        <w:tabs>
+          <w:tab w:val="num" w:pos="4320"/>
+        </w:tabs>
+        <w:ind w:left="4320" w:hanging="360"/>
+      </w:pPr>
+      <w:rPr>
+        <w:rFonts w:ascii="Wingdings" w:hAnsi="Wingdings" w:hint="default"/>
+        <w:sz w:val="20"/>
+      </w:rPr>
+    </w:lvl>
+    <w:lvl w:ilvl="6" w:tentative="1">
+      <w:start w:val="1"/>
+      <w:numFmt w:val="bullet"/>
+      <w:lvlText w:val=""/>
+      <w:lvlJc w:val="left"/>
+      <w:pPr>
+        <w:tabs>
+          <w:tab w:val="num" w:pos="5040"/>
+        </w:tabs>
+        <w:ind w:left="5040" w:hanging="360"/>
+      </w:pPr>
+      <w:rPr>
+        <w:rFonts w:ascii="Wingdings" w:hAnsi="Wingdings" w:hint="default"/>
+        <w:sz w:val="20"/>
+      </w:rPr>
+    </w:lvl>
+    <w:lvl w:ilvl="7" w:tentative="1">
+      <w:start w:val="1"/>
+      <w:numFmt w:val="bullet"/>
+      <w:lvlText w:val=""/>
+      <w:lvlJc w:val="left"/>
+      <w:pPr>
+        <w:tabs>
+          <w:tab w:val="num" w:pos="5760"/>
+        </w:tabs>
+        <w:ind w:left="5760" w:hanging="360"/>
+      </w:pPr>
+      <w:rPr>
+        <w:rFonts w:ascii="Wingdings" w:hAnsi="Wingdings" w:hint="default"/>
+        <w:sz w:val="20"/>
+      </w:rPr>
+    </w:lvl>
+    <w:lvl w:ilvl="8" w:tentative="1">
+      <w:start w:val="1"/>
+      <w:numFmt w:val="bullet"/>
+      <w:lvlText w:val=""/>
+      <w:lvlJc w:val="left"/>
+      <w:pPr>
+        <w:tabs>
+          <w:tab w:val="num" w:pos="6480"/>
+        </w:tabs>
+        <w:ind w:left="6480" w:hanging="360"/>
+      </w:pPr>
+      <w:rPr>
+        <w:rFonts w:ascii="Wingdings" w:hAnsi="Wingdings" w:hint="default"/>
+        <w:sz w:val="20"/>
+      </w:rPr>
+    </w:lvl>
+  </w:abstractNum>
+  <w:abstractNum w:abstractNumId="1" w15:restartNumberingAfterBreak="0">
     <w:nsid w:val="08CB0E99"/>
     <w:multiLevelType w:val="multilevel"/>
     <w:tmpl w:val="60028972"/>
@@ -8753,7 +9438,7 @@
       </w:rPr>
     </w:lvl>
   </w:abstractNum>
-  <w:abstractNum w:abstractNumId="1">
+  <w:abstractNum w:abstractNumId="2" w15:restartNumberingAfterBreak="0">
     <w:nsid w:val="12D63F1D"/>
     <w:multiLevelType w:val="multilevel"/>
     <w:tmpl w:val="15A83F00"/>
@@ -8902,7 +9587,7 @@
       </w:rPr>
     </w:lvl>
   </w:abstractNum>
-  <w:abstractNum w:abstractNumId="2">
+  <w:abstractNum w:abstractNumId="3" w15:restartNumberingAfterBreak="0">
     <w:nsid w:val="1AA44980"/>
     <w:multiLevelType w:val="multilevel"/>
     <w:tmpl w:val="F21E1106"/>
@@ -9051,7 +9736,7 @@
       </w:rPr>
     </w:lvl>
   </w:abstractNum>
-  <w:abstractNum w:abstractNumId="3">
+  <w:abstractNum w:abstractNumId="4" w15:restartNumberingAfterBreak="0">
     <w:nsid w:val="2717508F"/>
     <w:multiLevelType w:val="multilevel"/>
     <w:tmpl w:val="853CCAD0"/>
@@ -9200,7 +9885,7 @@
       </w:rPr>
     </w:lvl>
   </w:abstractNum>
-  <w:abstractNum w:abstractNumId="4">
+  <w:abstractNum w:abstractNumId="5" w15:restartNumberingAfterBreak="0">
     <w:nsid w:val="2DB23748"/>
     <w:multiLevelType w:val="multilevel"/>
     <w:tmpl w:val="14AEAB68"/>
@@ -9349,7 +10034,7 @@
       </w:rPr>
     </w:lvl>
   </w:abstractNum>
-  <w:abstractNum w:abstractNumId="5">
+  <w:abstractNum w:abstractNumId="6" w15:restartNumberingAfterBreak="0">
     <w:nsid w:val="379E6DF6"/>
     <w:multiLevelType w:val="multilevel"/>
     <w:tmpl w:val="925A0762"/>
@@ -9466,7 +10151,7 @@
       </w:pPr>
     </w:lvl>
   </w:abstractNum>
-  <w:abstractNum w:abstractNumId="6">
+  <w:abstractNum w:abstractNumId="7" w15:restartNumberingAfterBreak="0">
     <w:nsid w:val="3A882529"/>
     <w:multiLevelType w:val="multilevel"/>
     <w:tmpl w:val="97807328"/>
@@ -9583,7 +10268,7 @@
       </w:pPr>
     </w:lvl>
   </w:abstractNum>
-  <w:abstractNum w:abstractNumId="7">
+  <w:abstractNum w:abstractNumId="8" w15:restartNumberingAfterBreak="0">
     <w:nsid w:val="433577DA"/>
     <w:multiLevelType w:val="multilevel"/>
     <w:tmpl w:val="9274E670"/>
@@ -9732,7 +10417,7 @@
       </w:rPr>
     </w:lvl>
   </w:abstractNum>
-  <w:abstractNum w:abstractNumId="8">
+  <w:abstractNum w:abstractNumId="9" w15:restartNumberingAfterBreak="0">
     <w:nsid w:val="44955B4C"/>
     <w:multiLevelType w:val="multilevel"/>
     <w:tmpl w:val="8C24AB0C"/>
@@ -9881,7 +10566,7 @@
       </w:rPr>
     </w:lvl>
   </w:abstractNum>
-  <w:abstractNum w:abstractNumId="9">
+  <w:abstractNum w:abstractNumId="10" w15:restartNumberingAfterBreak="0">
     <w:nsid w:val="4A6D7F09"/>
     <w:multiLevelType w:val="multilevel"/>
     <w:tmpl w:val="B484D478"/>
@@ -10030,7 +10715,7 @@
       </w:rPr>
     </w:lvl>
   </w:abstractNum>
-  <w:abstractNum w:abstractNumId="10">
+  <w:abstractNum w:abstractNumId="11" w15:restartNumberingAfterBreak="0">
     <w:nsid w:val="4E8F7BFF"/>
     <w:multiLevelType w:val="multilevel"/>
     <w:tmpl w:val="7EAE80E8"/>
@@ -10143,7 +10828,7 @@
       </w:pPr>
     </w:lvl>
   </w:abstractNum>
-  <w:abstractNum w:abstractNumId="11">
+  <w:abstractNum w:abstractNumId="12" w15:restartNumberingAfterBreak="0">
     <w:nsid w:val="521D734F"/>
     <w:multiLevelType w:val="multilevel"/>
     <w:tmpl w:val="E22EA528"/>
@@ -10292,7 +10977,7 @@
       </w:rPr>
     </w:lvl>
   </w:abstractNum>
-  <w:abstractNum w:abstractNumId="12">
+  <w:abstractNum w:abstractNumId="13" w15:restartNumberingAfterBreak="0">
     <w:nsid w:val="56DE5A1B"/>
     <w:multiLevelType w:val="multilevel"/>
     <w:tmpl w:val="FF68DE02"/>
@@ -10405,7 +11090,7 @@
       </w:pPr>
     </w:lvl>
   </w:abstractNum>
-  <w:abstractNum w:abstractNumId="13">
+  <w:abstractNum w:abstractNumId="14" w15:restartNumberingAfterBreak="0">
     <w:nsid w:val="623139B6"/>
     <w:multiLevelType w:val="multilevel"/>
     <w:tmpl w:val="85CEA100"/>
@@ -10550,7 +11235,7 @@
       </w:rPr>
     </w:lvl>
   </w:abstractNum>
-  <w:abstractNum w:abstractNumId="14">
+  <w:abstractNum w:abstractNumId="15" w15:restartNumberingAfterBreak="0">
     <w:nsid w:val="64F26543"/>
     <w:multiLevelType w:val="multilevel"/>
     <w:tmpl w:val="16A2899A"/>
@@ -10699,7 +11384,7 @@
       </w:rPr>
     </w:lvl>
   </w:abstractNum>
-  <w:abstractNum w:abstractNumId="15">
+  <w:abstractNum w:abstractNumId="16" w15:restartNumberingAfterBreak="0">
     <w:nsid w:val="684D1257"/>
     <w:multiLevelType w:val="multilevel"/>
     <w:tmpl w:val="7C60F036"/>
@@ -10848,7 +11533,7 @@
       </w:rPr>
     </w:lvl>
   </w:abstractNum>
-  <w:abstractNum w:abstractNumId="16">
+  <w:abstractNum w:abstractNumId="17" w15:restartNumberingAfterBreak="0">
     <w:nsid w:val="6AF916FB"/>
     <w:multiLevelType w:val="multilevel"/>
     <w:tmpl w:val="7C565470"/>
@@ -10997,7 +11682,7 @@
       </w:rPr>
     </w:lvl>
   </w:abstractNum>
-  <w:abstractNum w:abstractNumId="17">
+  <w:abstractNum w:abstractNumId="18" w15:restartNumberingAfterBreak="0">
     <w:nsid w:val="70A077EF"/>
     <w:multiLevelType w:val="multilevel"/>
     <w:tmpl w:val="B846CF52"/>
@@ -11146,7 +11831,7 @@
       </w:rPr>
     </w:lvl>
   </w:abstractNum>
-  <w:abstractNum w:abstractNumId="18">
+  <w:abstractNum w:abstractNumId="19" w15:restartNumberingAfterBreak="0">
     <w:nsid w:val="72851E76"/>
     <w:multiLevelType w:val="multilevel"/>
     <w:tmpl w:val="9AA8AA40"/>
@@ -11295,7 +11980,7 @@
       </w:rPr>
     </w:lvl>
   </w:abstractNum>
-  <w:abstractNum w:abstractNumId="19">
+  <w:abstractNum w:abstractNumId="20" w15:restartNumberingAfterBreak="0">
     <w:nsid w:val="7DC718BE"/>
     <w:multiLevelType w:val="multilevel"/>
     <w:tmpl w:val="DC74D940"/>
@@ -11445,70 +12130,73 @@
     </w:lvl>
   </w:abstractNum>
   <w:num w:numId="1">
+    <w:abstractNumId w:val="16"/>
+  </w:num>
+  <w:num w:numId="2">
+    <w:abstractNumId w:val="6"/>
+  </w:num>
+  <w:num w:numId="3">
+    <w:abstractNumId w:val="3"/>
+  </w:num>
+  <w:num w:numId="4">
     <w:abstractNumId w:val="15"/>
   </w:num>
-  <w:num w:numId="2">
+  <w:num w:numId="5">
+    <w:abstractNumId w:val="12"/>
+  </w:num>
+  <w:num w:numId="6">
+    <w:abstractNumId w:val="10"/>
+  </w:num>
+  <w:num w:numId="7">
+    <w:abstractNumId w:val="14"/>
+  </w:num>
+  <w:num w:numId="8">
+    <w:abstractNumId w:val="8"/>
+  </w:num>
+  <w:num w:numId="9">
+    <w:abstractNumId w:val="18"/>
+  </w:num>
+  <w:num w:numId="10">
+    <w:abstractNumId w:val="9"/>
+  </w:num>
+  <w:num w:numId="11">
+    <w:abstractNumId w:val="20"/>
+  </w:num>
+  <w:num w:numId="12">
     <w:abstractNumId w:val="5"/>
   </w:num>
-  <w:num w:numId="3">
+  <w:num w:numId="13">
+    <w:abstractNumId w:val="19"/>
+  </w:num>
+  <w:num w:numId="14">
+    <w:abstractNumId w:val="1"/>
+  </w:num>
+  <w:num w:numId="15">
+    <w:abstractNumId w:val="4"/>
+  </w:num>
+  <w:num w:numId="16">
+    <w:abstractNumId w:val="13"/>
+  </w:num>
+  <w:num w:numId="17">
+    <w:abstractNumId w:val="7"/>
+  </w:num>
+  <w:num w:numId="18">
+    <w:abstractNumId w:val="11"/>
+  </w:num>
+  <w:num w:numId="19">
+    <w:abstractNumId w:val="17"/>
+  </w:num>
+  <w:num w:numId="20">
     <w:abstractNumId w:val="2"/>
   </w:num>
-  <w:num w:numId="4">
-    <w:abstractNumId w:val="14"/>
-  </w:num>
-  <w:num w:numId="5">
-    <w:abstractNumId w:val="11"/>
-  </w:num>
-  <w:num w:numId="6">
-    <w:abstractNumId w:val="9"/>
-  </w:num>
-  <w:num w:numId="7">
-    <w:abstractNumId w:val="13"/>
-  </w:num>
-  <w:num w:numId="8">
-    <w:abstractNumId w:val="7"/>
-  </w:num>
-  <w:num w:numId="9">
-    <w:abstractNumId w:val="17"/>
-  </w:num>
-  <w:num w:numId="10">
-    <w:abstractNumId w:val="8"/>
-  </w:num>
-  <w:num w:numId="11">
-    <w:abstractNumId w:val="19"/>
-  </w:num>
-  <w:num w:numId="12">
-    <w:abstractNumId w:val="4"/>
-  </w:num>
-  <w:num w:numId="13">
-    <w:abstractNumId w:val="18"/>
-  </w:num>
-  <w:num w:numId="14">
+  <w:num w:numId="21">
     <w:abstractNumId w:val="0"/>
-  </w:num>
-  <w:num w:numId="15">
-    <w:abstractNumId w:val="3"/>
-  </w:num>
-  <w:num w:numId="16">
-    <w:abstractNumId w:val="12"/>
-  </w:num>
-  <w:num w:numId="17">
-    <w:abstractNumId w:val="6"/>
-  </w:num>
-  <w:num w:numId="18">
-    <w:abstractNumId w:val="10"/>
-  </w:num>
-  <w:num w:numId="19">
-    <w:abstractNumId w:val="16"/>
-  </w:num>
-  <w:num w:numId="20">
-    <w:abstractNumId w:val="1"/>
   </w:num>
 </w:numbering>
 </file>
 
 <file path=word/styles.xml><?xml version="1.0" encoding="utf-8"?>
-<w:styles xmlns:mc="http://schemas.openxmlformats.org/markup-compatibility/2006" xmlns:r="http://schemas.openxmlformats.org/officeDocument/2006/relationships" xmlns:w="http://schemas.openxmlformats.org/wordprocessingml/2006/main" xmlns:w14="http://schemas.microsoft.com/office/word/2010/wordml" mc:Ignorable="w14">
+<w:styles xmlns:mc="http://schemas.openxmlformats.org/markup-compatibility/2006" xmlns:r="http://schemas.openxmlformats.org/officeDocument/2006/relationships" xmlns:w="http://schemas.openxmlformats.org/wordprocessingml/2006/main" xmlns:w14="http://schemas.microsoft.com/office/word/2010/wordml" xmlns:w15="http://schemas.microsoft.com/office/word/2012/wordml" xmlns:w16cex="http://schemas.microsoft.com/office/word/2018/wordml/cex" xmlns:w16cid="http://schemas.microsoft.com/office/word/2016/wordml/cid" xmlns:w16="http://schemas.microsoft.com/office/word/2018/wordml" xmlns:w16sdtdh="http://schemas.microsoft.com/office/word/2020/wordml/sdtdatahash" xmlns:w16se="http://schemas.microsoft.com/office/word/2015/wordml/symex" mc:Ignorable="w14 w15 w16se w16cid w16 w16cex w16sdtdh">
   <w:docDefaults>
     <w:rPrDefault>
       <w:rPr>
@@ -11524,144 +12212,383 @@
       </w:pPr>
     </w:pPrDefault>
   </w:docDefaults>
-  <w:latentStyles w:defLockedState="0" w:defUIPriority="99" w:defSemiHidden="1" w:defUnhideWhenUsed="1" w:defQFormat="0" w:count="267">
-    <w:lsdException w:name="Normal" w:semiHidden="0" w:uiPriority="0" w:unhideWhenUsed="0" w:qFormat="1"/>
-    <w:lsdException w:name="heading 1" w:semiHidden="0" w:uiPriority="9" w:unhideWhenUsed="0" w:qFormat="1"/>
-    <w:lsdException w:name="heading 2" w:uiPriority="9" w:qFormat="1"/>
-    <w:lsdException w:name="heading 3" w:uiPriority="9" w:qFormat="1"/>
-    <w:lsdException w:name="heading 4" w:uiPriority="9" w:qFormat="1"/>
-    <w:lsdException w:name="heading 5" w:uiPriority="9" w:qFormat="1"/>
-    <w:lsdException w:name="heading 6" w:uiPriority="9" w:qFormat="1"/>
-    <w:lsdException w:name="heading 7" w:uiPriority="9" w:qFormat="1"/>
-    <w:lsdException w:name="heading 8" w:uiPriority="9" w:qFormat="1"/>
-    <w:lsdException w:name="heading 9" w:uiPriority="9" w:qFormat="1"/>
-    <w:lsdException w:name="toc 1" w:uiPriority="39"/>
-    <w:lsdException w:name="toc 2" w:uiPriority="39"/>
-    <w:lsdException w:name="toc 3" w:uiPriority="39"/>
-    <w:lsdException w:name="toc 4" w:uiPriority="39"/>
-    <w:lsdException w:name="toc 5" w:uiPriority="39"/>
-    <w:lsdException w:name="toc 6" w:uiPriority="39"/>
-    <w:lsdException w:name="toc 7" w:uiPriority="39"/>
-    <w:lsdException w:name="toc 8" w:uiPriority="39"/>
-    <w:lsdException w:name="toc 9" w:uiPriority="39"/>
-    <w:lsdException w:name="caption" w:uiPriority="35" w:qFormat="1"/>
-    <w:lsdException w:name="Title" w:semiHidden="0" w:uiPriority="10" w:unhideWhenUsed="0" w:qFormat="1"/>
-    <w:lsdException w:name="Default Paragraph Font" w:uiPriority="1"/>
-    <w:lsdException w:name="Subtitle" w:semiHidden="0" w:uiPriority="11" w:unhideWhenUsed="0" w:qFormat="1"/>
-    <w:lsdException w:name="Strong" w:semiHidden="0" w:uiPriority="22" w:unhideWhenUsed="0" w:qFormat="1"/>
-    <w:lsdException w:name="Emphasis" w:semiHidden="0" w:uiPriority="20" w:unhideWhenUsed="0" w:qFormat="1"/>
-    <w:lsdException w:name="Table Grid" w:semiHidden="0" w:uiPriority="59" w:unhideWhenUsed="0"/>
-    <w:lsdException w:name="Placeholder Text" w:unhideWhenUsed="0"/>
-    <w:lsdException w:name="No Spacing" w:semiHidden="0" w:uiPriority="1" w:unhideWhenUsed="0" w:qFormat="1"/>
-    <w:lsdException w:name="Light Shading" w:semiHidden="0" w:uiPriority="60" w:unhideWhenUsed="0"/>
-    <w:lsdException w:name="Light List" w:semiHidden="0" w:uiPriority="61" w:unhideWhenUsed="0"/>
-    <w:lsdException w:name="Light Grid" w:semiHidden="0" w:uiPriority="62" w:unhideWhenUsed="0"/>
-    <w:lsdException w:name="Medium Shading 1" w:semiHidden="0" w:uiPriority="63" w:unhideWhenUsed="0"/>
-    <w:lsdException w:name="Medium Shading 2" w:semiHidden="0" w:uiPriority="64" w:unhideWhenUsed="0"/>
-    <w:lsdException w:name="Medium List 1" w:semiHidden="0" w:uiPriority="65" w:unhideWhenUsed="0"/>
-    <w:lsdException w:name="Medium List 2" w:semiHidden="0" w:uiPriority="66" w:unhideWhenUsed="0"/>
-    <w:lsdException w:name="Medium Grid 1" w:semiHidden="0" w:uiPriority="67" w:unhideWhenUsed="0"/>
-    <w:lsdException w:name="Medium Grid 2" w:semiHidden="0" w:uiPriority="68" w:unhideWhenUsed="0"/>
-    <w:lsdException w:name="Medium Grid 3" w:semiHidden="0" w:uiPriority="69" w:unhideWhenUsed="0"/>
-    <w:lsdException w:name="Dark List" w:semiHidden="0" w:uiPriority="70" w:unhideWhenUsed="0"/>
-    <w:lsdException w:name="Colorful Shading" w:semiHidden="0" w:uiPriority="71" w:unhideWhenUsed="0"/>
-    <w:lsdException w:name="Colorful List" w:semiHidden="0" w:uiPriority="72" w:unhideWhenUsed="0"/>
-    <w:lsdException w:name="Colorful Grid" w:semiHidden="0" w:uiPriority="73" w:unhideWhenUsed="0"/>
-    <w:lsdException w:name="Light Shading Accent 1" w:semiHidden="0" w:uiPriority="60" w:unhideWhenUsed="0"/>
-    <w:lsdException w:name="Light List Accent 1" w:semiHidden="0" w:uiPriority="61" w:unhideWhenUsed="0"/>
-    <w:lsdException w:name="Light Grid Accent 1" w:semiHidden="0" w:uiPriority="62" w:unhideWhenUsed="0"/>
-    <w:lsdException w:name="Medium Shading 1 Accent 1" w:semiHidden="0" w:uiPriority="63" w:unhideWhenUsed="0"/>
-    <w:lsdException w:name="Medium Shading 2 Accent 1" w:semiHidden="0" w:uiPriority="64" w:unhideWhenUsed="0"/>
-    <w:lsdException w:name="Medium List 1 Accent 1" w:semiHidden="0" w:uiPriority="65" w:unhideWhenUsed="0"/>
-    <w:lsdException w:name="Revision" w:unhideWhenUsed="0"/>
-    <w:lsdException w:name="List Paragraph" w:semiHidden="0" w:uiPriority="34" w:unhideWhenUsed="0" w:qFormat="1"/>
-    <w:lsdException w:name="Quote" w:semiHidden="0" w:uiPriority="29" w:unhideWhenUsed="0" w:qFormat="1"/>
-    <w:lsdException w:name="Intense Quote" w:semiHidden="0" w:uiPriority="30" w:unhideWhenUsed="0" w:qFormat="1"/>
-    <w:lsdException w:name="Medium List 2 Accent 1" w:semiHidden="0" w:uiPriority="66" w:unhideWhenUsed="0"/>
-    <w:lsdException w:name="Medium Grid 1 Accent 1" w:semiHidden="0" w:uiPriority="67" w:unhideWhenUsed="0"/>
-    <w:lsdException w:name="Medium Grid 2 Accent 1" w:semiHidden="0" w:uiPriority="68" w:unhideWhenUsed="0"/>
-    <w:lsdException w:name="Medium Grid 3 Accent 1" w:semiHidden="0" w:uiPriority="69" w:unhideWhenUsed="0"/>
-    <w:lsdException w:name="Dark List Accent 1" w:semiHidden="0" w:uiPriority="70" w:unhideWhenUsed="0"/>
-    <w:lsdException w:name="Colorful Shading Accent 1" w:semiHidden="0" w:uiPriority="71" w:unhideWhenUsed="0"/>
-    <w:lsdException w:name="Colorful List Accent 1" w:semiHidden="0" w:uiPriority="72" w:unhideWhenUsed="0"/>
-    <w:lsdException w:name="Colorful Grid Accent 1" w:semiHidden="0" w:uiPriority="73" w:unhideWhenUsed="0"/>
-    <w:lsdException w:name="Light Shading Accent 2" w:semiHidden="0" w:uiPriority="60" w:unhideWhenUsed="0"/>
-    <w:lsdException w:name="Light List Accent 2" w:semiHidden="0" w:uiPriority="61" w:unhideWhenUsed="0"/>
-    <w:lsdException w:name="Light Grid Accent 2" w:semiHidden="0" w:uiPriority="62" w:unhideWhenUsed="0"/>
-    <w:lsdException w:name="Medium Shading 1 Accent 2" w:semiHidden="0" w:uiPriority="63" w:unhideWhenUsed="0"/>
-    <w:lsdException w:name="Medium Shading 2 Accent 2" w:semiHidden="0" w:uiPriority="64" w:unhideWhenUsed="0"/>
-    <w:lsdException w:name="Medium List 1 Accent 2" w:semiHidden="0" w:uiPriority="65" w:unhideWhenUsed="0"/>
-    <w:lsdException w:name="Medium List 2 Accent 2" w:semiHidden="0" w:uiPriority="66" w:unhideWhenUsed="0"/>
-    <w:lsdException w:name="Medium Grid 1 Accent 2" w:semiHidden="0" w:uiPriority="67" w:unhideWhenUsed="0"/>
-    <w:lsdException w:name="Medium Grid 2 Accent 2" w:semiHidden="0" w:uiPriority="68" w:unhideWhenUsed="0"/>
-    <w:lsdException w:name="Medium Grid 3 Accent 2" w:semiHidden="0" w:uiPriority="69" w:unhideWhenUsed="0"/>
-    <w:lsdException w:name="Dark List Accent 2" w:semiHidden="0" w:uiPriority="70" w:unhideWhenUsed="0"/>
-    <w:lsdException w:name="Colorful Shading Accent 2" w:semiHidden="0" w:uiPriority="71" w:unhideWhenUsed="0"/>
-    <w:lsdException w:name="Colorful List Accent 2" w:semiHidden="0" w:uiPriority="72" w:unhideWhenUsed="0"/>
-    <w:lsdException w:name="Colorful Grid Accent 2" w:semiHidden="0" w:uiPriority="73" w:unhideWhenUsed="0"/>
-    <w:lsdException w:name="Light Shading Accent 3" w:semiHidden="0" w:uiPriority="60" w:unhideWhenUsed="0"/>
-    <w:lsdException w:name="Light List Accent 3" w:semiHidden="0" w:uiPriority="61" w:unhideWhenUsed="0"/>
-    <w:lsdException w:name="Light Grid Accent 3" w:semiHidden="0" w:uiPriority="62" w:unhideWhenUsed="0"/>
-    <w:lsdException w:name="Medium Shading 1 Accent 3" w:semiHidden="0" w:uiPriority="63" w:unhideWhenUsed="0"/>
-    <w:lsdException w:name="Medium Shading 2 Accent 3" w:semiHidden="0" w:uiPriority="64" w:unhideWhenUsed="0"/>
-    <w:lsdException w:name="Medium List 1 Accent 3" w:semiHidden="0" w:uiPriority="65" w:unhideWhenUsed="0"/>
-    <w:lsdException w:name="Medium List 2 Accent 3" w:semiHidden="0" w:uiPriority="66" w:unhideWhenUsed="0"/>
-    <w:lsdException w:name="Medium Grid 1 Accent 3" w:semiHidden="0" w:uiPriority="67" w:unhideWhenUsed="0"/>
-    <w:lsdException w:name="Medium Grid 2 Accent 3" w:semiHidden="0" w:uiPriority="68" w:unhideWhenUsed="0"/>
-    <w:lsdException w:name="Medium Grid 3 Accent 3" w:semiHidden="0" w:uiPriority="69" w:unhideWhenUsed="0"/>
-    <w:lsdException w:name="Dark List Accent 3" w:semiHidden="0" w:uiPriority="70" w:unhideWhenUsed="0"/>
-    <w:lsdException w:name="Colorful Shading Accent 3" w:semiHidden="0" w:uiPriority="71" w:unhideWhenUsed="0"/>
-    <w:lsdException w:name="Colorful List Accent 3" w:semiHidden="0" w:uiPriority="72" w:unhideWhenUsed="0"/>
-    <w:lsdException w:name="Colorful Grid Accent 3" w:semiHidden="0" w:uiPriority="73" w:unhideWhenUsed="0"/>
-    <w:lsdException w:name="Light Shading Accent 4" w:semiHidden="0" w:uiPriority="60" w:unhideWhenUsed="0"/>
-    <w:lsdException w:name="Light List Accent 4" w:semiHidden="0" w:uiPriority="61" w:unhideWhenUsed="0"/>
-    <w:lsdException w:name="Light Grid Accent 4" w:semiHidden="0" w:uiPriority="62" w:unhideWhenUsed="0"/>
-    <w:lsdException w:name="Medium Shading 1 Accent 4" w:semiHidden="0" w:uiPriority="63" w:unhideWhenUsed="0"/>
-    <w:lsdException w:name="Medium Shading 2 Accent 4" w:semiHidden="0" w:uiPriority="64" w:unhideWhenUsed="0"/>
-    <w:lsdException w:name="Medium List 1 Accent 4" w:semiHidden="0" w:uiPriority="65" w:unhideWhenUsed="0"/>
-    <w:lsdException w:name="Medium List 2 Accent 4" w:semiHidden="0" w:uiPriority="66" w:unhideWhenUsed="0"/>
-    <w:lsdException w:name="Medium Grid 1 Accent 4" w:semiHidden="0" w:uiPriority="67" w:unhideWhenUsed="0"/>
-    <w:lsdException w:name="Medium Grid 2 Accent 4" w:semiHidden="0" w:uiPriority="68" w:unhideWhenUsed="0"/>
-    <w:lsdException w:name="Medium Grid 3 Accent 4" w:semiHidden="0" w:uiPriority="69" w:unhideWhenUsed="0"/>
-    <w:lsdException w:name="Dark List Accent 4" w:semiHidden="0" w:uiPriority="70" w:unhideWhenUsed="0"/>
-    <w:lsdException w:name="Colorful Shading Accent 4" w:semiHidden="0" w:uiPriority="71" w:unhideWhenUsed="0"/>
-    <w:lsdException w:name="Colorful List Accent 4" w:semiHidden="0" w:uiPriority="72" w:unhideWhenUsed="0"/>
-    <w:lsdException w:name="Colorful Grid Accent 4" w:semiHidden="0" w:uiPriority="73" w:unhideWhenUsed="0"/>
-    <w:lsdException w:name="Light Shading Accent 5" w:semiHidden="0" w:uiPriority="60" w:unhideWhenUsed="0"/>
-    <w:lsdException w:name="Light List Accent 5" w:semiHidden="0" w:uiPriority="61" w:unhideWhenUsed="0"/>
-    <w:lsdException w:name="Light Grid Accent 5" w:semiHidden="0" w:uiPriority="62" w:unhideWhenUsed="0"/>
-    <w:lsdException w:name="Medium Shading 1 Accent 5" w:semiHidden="0" w:uiPriority="63" w:unhideWhenUsed="0"/>
-    <w:lsdException w:name="Medium Shading 2 Accent 5" w:semiHidden="0" w:uiPriority="64" w:unhideWhenUsed="0"/>
-    <w:lsdException w:name="Medium List 1 Accent 5" w:semiHidden="0" w:uiPriority="65" w:unhideWhenUsed="0"/>
-    <w:lsdException w:name="Medium List 2 Accent 5" w:semiHidden="0" w:uiPriority="66" w:unhideWhenUsed="0"/>
-    <w:lsdException w:name="Medium Grid 1 Accent 5" w:semiHidden="0" w:uiPriority="67" w:unhideWhenUsed="0"/>
-    <w:lsdException w:name="Medium Grid 2 Accent 5" w:semiHidden="0" w:uiPriority="68" w:unhideWhenUsed="0"/>
-    <w:lsdException w:name="Medium Grid 3 Accent 5" w:semiHidden="0" w:uiPriority="69" w:unhideWhenUsed="0"/>
-    <w:lsdException w:name="Dark List Accent 5" w:semiHidden="0" w:uiPriority="70" w:unhideWhenUsed="0"/>
-    <w:lsdException w:name="Colorful Shading Accent 5" w:semiHidden="0" w:uiPriority="71" w:unhideWhenUsed="0"/>
-    <w:lsdException w:name="Colorful List Accent 5" w:semiHidden="0" w:uiPriority="72" w:unhideWhenUsed="0"/>
-    <w:lsdException w:name="Colorful Grid Accent 5" w:semiHidden="0" w:uiPriority="73" w:unhideWhenUsed="0"/>
-    <w:lsdException w:name="Light Shading Accent 6" w:semiHidden="0" w:uiPriority="60" w:unhideWhenUsed="0"/>
-    <w:lsdException w:name="Light List Accent 6" w:semiHidden="0" w:uiPriority="61" w:unhideWhenUsed="0"/>
-    <w:lsdException w:name="Light Grid Accent 6" w:semiHidden="0" w:uiPriority="62" w:unhideWhenUsed="0"/>
-    <w:lsdException w:name="Medium Shading 1 Accent 6" w:semiHidden="0" w:uiPriority="63" w:unhideWhenUsed="0"/>
-    <w:lsdException w:name="Medium Shading 2 Accent 6" w:semiHidden="0" w:uiPriority="64" w:unhideWhenUsed="0"/>
-    <w:lsdException w:name="Medium List 1 Accent 6" w:semiHidden="0" w:uiPriority="65" w:unhideWhenUsed="0"/>
-    <w:lsdException w:name="Medium List 2 Accent 6" w:semiHidden="0" w:uiPriority="66" w:unhideWhenUsed="0"/>
-    <w:lsdException w:name="Medium Grid 1 Accent 6" w:semiHidden="0" w:uiPriority="67" w:unhideWhenUsed="0"/>
-    <w:lsdException w:name="Medium Grid 2 Accent 6" w:semiHidden="0" w:uiPriority="68" w:unhideWhenUsed="0"/>
-    <w:lsdException w:name="Medium Grid 3 Accent 6" w:semiHidden="0" w:uiPriority="69" w:unhideWhenUsed="0"/>
-    <w:lsdException w:name="Dark List Accent 6" w:semiHidden="0" w:uiPriority="70" w:unhideWhenUsed="0"/>
-    <w:lsdException w:name="Colorful Shading Accent 6" w:semiHidden="0" w:uiPriority="71" w:unhideWhenUsed="0"/>
-    <w:lsdException w:name="Colorful List Accent 6" w:semiHidden="0" w:uiPriority="72" w:unhideWhenUsed="0"/>
-    <w:lsdException w:name="Colorful Grid Accent 6" w:semiHidden="0" w:uiPriority="73" w:unhideWhenUsed="0"/>
-    <w:lsdException w:name="Subtle Emphasis" w:semiHidden="0" w:uiPriority="19" w:unhideWhenUsed="0" w:qFormat="1"/>
-    <w:lsdException w:name="Intense Emphasis" w:semiHidden="0" w:uiPriority="21" w:unhideWhenUsed="0" w:qFormat="1"/>
-    <w:lsdException w:name="Subtle Reference" w:semiHidden="0" w:uiPriority="31" w:unhideWhenUsed="0" w:qFormat="1"/>
-    <w:lsdException w:name="Intense Reference" w:semiHidden="0" w:uiPriority="32" w:unhideWhenUsed="0" w:qFormat="1"/>
-    <w:lsdException w:name="Book Title" w:semiHidden="0" w:uiPriority="33" w:unhideWhenUsed="0" w:qFormat="1"/>
-    <w:lsdException w:name="Bibliography" w:uiPriority="37"/>
-    <w:lsdException w:name="TOC Heading" w:uiPriority="39" w:qFormat="1"/>
+  <w:latentStyles w:defLockedState="0" w:defUIPriority="99" w:defSemiHidden="0" w:defUnhideWhenUsed="0" w:defQFormat="0" w:count="376">
+    <w:lsdException w:name="Normal" w:uiPriority="0" w:qFormat="1"/>
+    <w:lsdException w:name="heading 1" w:uiPriority="9" w:qFormat="1"/>
+    <w:lsdException w:name="heading 2" w:semiHidden="1" w:uiPriority="9" w:unhideWhenUsed="1" w:qFormat="1"/>
+    <w:lsdException w:name="heading 3" w:semiHidden="1" w:uiPriority="9" w:unhideWhenUsed="1" w:qFormat="1"/>
+    <w:lsdException w:name="heading 4" w:semiHidden="1" w:uiPriority="9" w:unhideWhenUsed="1" w:qFormat="1"/>
+    <w:lsdException w:name="heading 5" w:semiHidden="1" w:uiPriority="9" w:unhideWhenUsed="1" w:qFormat="1"/>
+    <w:lsdException w:name="heading 6" w:semiHidden="1" w:uiPriority="9" w:unhideWhenUsed="1" w:qFormat="1"/>
+    <w:lsdException w:name="heading 7" w:semiHidden="1" w:uiPriority="9" w:unhideWhenUsed="1" w:qFormat="1"/>
+    <w:lsdException w:name="heading 8" w:semiHidden="1" w:uiPriority="9" w:unhideWhenUsed="1" w:qFormat="1"/>
+    <w:lsdException w:name="heading 9" w:semiHidden="1" w:uiPriority="9" w:unhideWhenUsed="1" w:qFormat="1"/>
+    <w:lsdException w:name="index 1" w:semiHidden="1" w:unhideWhenUsed="1"/>
+    <w:lsdException w:name="index 2" w:semiHidden="1" w:unhideWhenUsed="1"/>
+    <w:lsdException w:name="index 3" w:semiHidden="1" w:unhideWhenUsed="1"/>
+    <w:lsdException w:name="index 4" w:semiHidden="1" w:unhideWhenUsed="1"/>
+    <w:lsdException w:name="index 5" w:semiHidden="1" w:unhideWhenUsed="1"/>
+    <w:lsdException w:name="index 6" w:semiHidden="1" w:unhideWhenUsed="1"/>
+    <w:lsdException w:name="index 7" w:semiHidden="1" w:unhideWhenUsed="1"/>
+    <w:lsdException w:name="index 8" w:semiHidden="1" w:unhideWhenUsed="1"/>
+    <w:lsdException w:name="index 9" w:semiHidden="1" w:unhideWhenUsed="1"/>
+    <w:lsdException w:name="toc 1" w:semiHidden="1" w:uiPriority="39" w:unhideWhenUsed="1"/>
+    <w:lsdException w:name="toc 2" w:semiHidden="1" w:uiPriority="39" w:unhideWhenUsed="1"/>
+    <w:lsdException w:name="toc 3" w:semiHidden="1" w:uiPriority="39" w:unhideWhenUsed="1"/>
+    <w:lsdException w:name="toc 4" w:semiHidden="1" w:uiPriority="39" w:unhideWhenUsed="1"/>
+    <w:lsdException w:name="toc 5" w:semiHidden="1" w:uiPriority="39" w:unhideWhenUsed="1"/>
+    <w:lsdException w:name="toc 6" w:semiHidden="1" w:uiPriority="39" w:unhideWhenUsed="1"/>
+    <w:lsdException w:name="toc 7" w:semiHidden="1" w:uiPriority="39" w:unhideWhenUsed="1"/>
+    <w:lsdException w:name="toc 8" w:semiHidden="1" w:uiPriority="39" w:unhideWhenUsed="1"/>
+    <w:lsdException w:name="toc 9" w:semiHidden="1" w:uiPriority="39" w:unhideWhenUsed="1"/>
+    <w:lsdException w:name="Normal Indent" w:semiHidden="1" w:unhideWhenUsed="1"/>
+    <w:lsdException w:name="footnote text" w:semiHidden="1" w:unhideWhenUsed="1"/>
+    <w:lsdException w:name="annotation text" w:semiHidden="1" w:unhideWhenUsed="1"/>
+    <w:lsdException w:name="header" w:semiHidden="1" w:unhideWhenUsed="1"/>
+    <w:lsdException w:name="footer" w:semiHidden="1" w:unhideWhenUsed="1"/>
+    <w:lsdException w:name="index heading" w:semiHidden="1" w:unhideWhenUsed="1"/>
+    <w:lsdException w:name="caption" w:semiHidden="1" w:uiPriority="35" w:unhideWhenUsed="1" w:qFormat="1"/>
+    <w:lsdException w:name="table of figures" w:semiHidden="1" w:unhideWhenUsed="1"/>
+    <w:lsdException w:name="envelope address" w:semiHidden="1" w:unhideWhenUsed="1"/>
+    <w:lsdException w:name="envelope return" w:semiHidden="1" w:unhideWhenUsed="1"/>
+    <w:lsdException w:name="footnote reference" w:semiHidden="1" w:unhideWhenUsed="1"/>
+    <w:lsdException w:name="annotation reference" w:semiHidden="1" w:unhideWhenUsed="1"/>
+    <w:lsdException w:name="line number" w:semiHidden="1" w:unhideWhenUsed="1"/>
+    <w:lsdException w:name="page number" w:semiHidden="1" w:unhideWhenUsed="1"/>
+    <w:lsdException w:name="endnote reference" w:semiHidden="1" w:unhideWhenUsed="1"/>
+    <w:lsdException w:name="endnote text" w:semiHidden="1" w:unhideWhenUsed="1"/>
+    <w:lsdException w:name="table of authorities" w:semiHidden="1" w:unhideWhenUsed="1"/>
+    <w:lsdException w:name="macro" w:semiHidden="1" w:unhideWhenUsed="1"/>
+    <w:lsdException w:name="toa heading" w:semiHidden="1" w:unhideWhenUsed="1"/>
+    <w:lsdException w:name="List" w:semiHidden="1" w:unhideWhenUsed="1"/>
+    <w:lsdException w:name="List Bullet" w:semiHidden="1" w:unhideWhenUsed="1"/>
+    <w:lsdException w:name="List Number" w:semiHidden="1" w:unhideWhenUsed="1"/>
+    <w:lsdException w:name="List 2" w:semiHidden="1" w:unhideWhenUsed="1"/>
+    <w:lsdException w:name="List 3" w:semiHidden="1" w:unhideWhenUsed="1"/>
+    <w:lsdException w:name="List 4" w:semiHidden="1" w:unhideWhenUsed="1"/>
+    <w:lsdException w:name="List 5" w:semiHidden="1" w:unhideWhenUsed="1"/>
+    <w:lsdException w:name="List Bullet 2" w:semiHidden="1" w:unhideWhenUsed="1"/>
+    <w:lsdException w:name="List Bullet 3" w:semiHidden="1" w:unhideWhenUsed="1"/>
+    <w:lsdException w:name="List Bullet 4" w:semiHidden="1" w:unhideWhenUsed="1"/>
+    <w:lsdException w:name="List Bullet 5" w:semiHidden="1" w:unhideWhenUsed="1"/>
+    <w:lsdException w:name="List Number 2" w:semiHidden="1" w:unhideWhenUsed="1"/>
+    <w:lsdException w:name="List Number 3" w:semiHidden="1" w:unhideWhenUsed="1"/>
+    <w:lsdException w:name="List Number 4" w:semiHidden="1" w:unhideWhenUsed="1"/>
+    <w:lsdException w:name="List Number 5" w:semiHidden="1" w:unhideWhenUsed="1"/>
+    <w:lsdException w:name="Title" w:uiPriority="10" w:qFormat="1"/>
+    <w:lsdException w:name="Closing" w:semiHidden="1" w:unhideWhenUsed="1"/>
+    <w:lsdException w:name="Signature" w:semiHidden="1" w:unhideWhenUsed="1"/>
+    <w:lsdException w:name="Default Paragraph Font" w:semiHidden="1" w:uiPriority="1" w:unhideWhenUsed="1"/>
+    <w:lsdException w:name="Body Text" w:semiHidden="1" w:unhideWhenUsed="1"/>
+    <w:lsdException w:name="Body Text Indent" w:semiHidden="1" w:unhideWhenUsed="1"/>
+    <w:lsdException w:name="List Continue" w:semiHidden="1" w:unhideWhenUsed="1"/>
+    <w:lsdException w:name="List Continue 2" w:semiHidden="1" w:unhideWhenUsed="1"/>
+    <w:lsdException w:name="List Continue 3" w:semiHidden="1" w:unhideWhenUsed="1"/>
+    <w:lsdException w:name="List Continue 4" w:semiHidden="1" w:unhideWhenUsed="1"/>
+    <w:lsdException w:name="List Continue 5" w:semiHidden="1" w:unhideWhenUsed="1"/>
+    <w:lsdException w:name="Message Header" w:semiHidden="1" w:unhideWhenUsed="1"/>
+    <w:lsdException w:name="Subtitle" w:uiPriority="11" w:qFormat="1"/>
+    <w:lsdException w:name="Salutation" w:semiHidden="1" w:unhideWhenUsed="1"/>
+    <w:lsdException w:name="Date" w:semiHidden="1" w:unhideWhenUsed="1"/>
+    <w:lsdException w:name="Body Text First Indent" w:semiHidden="1" w:unhideWhenUsed="1"/>
+    <w:lsdException w:name="Body Text First Indent 2" w:semiHidden="1" w:unhideWhenUsed="1"/>
+    <w:lsdException w:name="Note Heading" w:semiHidden="1" w:unhideWhenUsed="1"/>
+    <w:lsdException w:name="Body Text 2" w:semiHidden="1" w:unhideWhenUsed="1"/>
+    <w:lsdException w:name="Body Text 3" w:semiHidden="1" w:unhideWhenUsed="1"/>
+    <w:lsdException w:name="Body Text Indent 2" w:semiHidden="1" w:unhideWhenUsed="1"/>
+    <w:lsdException w:name="Body Text Indent 3" w:semiHidden="1" w:unhideWhenUsed="1"/>
+    <w:lsdException w:name="Block Text" w:semiHidden="1" w:unhideWhenUsed="1"/>
+    <w:lsdException w:name="Hyperlink" w:semiHidden="1" w:unhideWhenUsed="1"/>
+    <w:lsdException w:name="FollowedHyperlink" w:semiHidden="1" w:unhideWhenUsed="1"/>
+    <w:lsdException w:name="Strong" w:uiPriority="22" w:qFormat="1"/>
+    <w:lsdException w:name="Emphasis" w:uiPriority="20" w:qFormat="1"/>
+    <w:lsdException w:name="Document Map" w:semiHidden="1" w:unhideWhenUsed="1"/>
+    <w:lsdException w:name="Plain Text" w:semiHidden="1" w:unhideWhenUsed="1"/>
+    <w:lsdException w:name="E-mail Signature" w:semiHidden="1" w:unhideWhenUsed="1"/>
+    <w:lsdException w:name="HTML Top of Form" w:semiHidden="1" w:unhideWhenUsed="1"/>
+    <w:lsdException w:name="HTML Bottom of Form" w:semiHidden="1" w:unhideWhenUsed="1"/>
+    <w:lsdException w:name="Normal (Web)" w:semiHidden="1" w:unhideWhenUsed="1"/>
+    <w:lsdException w:name="HTML Acronym" w:semiHidden="1" w:unhideWhenUsed="1"/>
+    <w:lsdException w:name="HTML Address" w:semiHidden="1" w:unhideWhenUsed="1"/>
+    <w:lsdException w:name="HTML Cite" w:semiHidden="1" w:unhideWhenUsed="1"/>
+    <w:lsdException w:name="HTML Code" w:semiHidden="1" w:unhideWhenUsed="1"/>
+    <w:lsdException w:name="HTML Definition" w:semiHidden="1" w:unhideWhenUsed="1"/>
+    <w:lsdException w:name="HTML Keyboard" w:semiHidden="1" w:unhideWhenUsed="1"/>
+    <w:lsdException w:name="HTML Preformatted" w:semiHidden="1" w:unhideWhenUsed="1"/>
+    <w:lsdException w:name="HTML Sample" w:semiHidden="1" w:unhideWhenUsed="1"/>
+    <w:lsdException w:name="HTML Typewriter" w:semiHidden="1" w:unhideWhenUsed="1"/>
+    <w:lsdException w:name="HTML Variable" w:semiHidden="1" w:unhideWhenUsed="1"/>
+    <w:lsdException w:name="Normal Table" w:semiHidden="1" w:unhideWhenUsed="1"/>
+    <w:lsdException w:name="annotation subject" w:semiHidden="1" w:unhideWhenUsed="1"/>
+    <w:lsdException w:name="No List" w:semiHidden="1" w:unhideWhenUsed="1"/>
+    <w:lsdException w:name="Outline List 1" w:semiHidden="1" w:unhideWhenUsed="1"/>
+    <w:lsdException w:name="Outline List 2" w:semiHidden="1" w:unhideWhenUsed="1"/>
+    <w:lsdException w:name="Outline List 3" w:semiHidden="1" w:unhideWhenUsed="1"/>
+    <w:lsdException w:name="Table Simple 1" w:semiHidden="1" w:unhideWhenUsed="1"/>
+    <w:lsdException w:name="Table Simple 2" w:semiHidden="1" w:unhideWhenUsed="1"/>
+    <w:lsdException w:name="Table Simple 3" w:semiHidden="1" w:unhideWhenUsed="1"/>
+    <w:lsdException w:name="Table Classic 1" w:semiHidden="1" w:unhideWhenUsed="1"/>
+    <w:lsdException w:name="Table Classic 2" w:semiHidden="1" w:unhideWhenUsed="1"/>
+    <w:lsdException w:name="Table Classic 3" w:semiHidden="1" w:unhideWhenUsed="1"/>
+    <w:lsdException w:name="Table Classic 4" w:semiHidden="1" w:unhideWhenUsed="1"/>
+    <w:lsdException w:name="Table Colorful 1" w:semiHidden="1" w:unhideWhenUsed="1"/>
+    <w:lsdException w:name="Table Colorful 2" w:semiHidden="1" w:unhideWhenUsed="1"/>
+    <w:lsdException w:name="Table Colorful 3" w:semiHidden="1" w:unhideWhenUsed="1"/>
+    <w:lsdException w:name="Table Columns 1" w:semiHidden="1" w:unhideWhenUsed="1"/>
+    <w:lsdException w:name="Table Columns 2" w:semiHidden="1" w:unhideWhenUsed="1"/>
+    <w:lsdException w:name="Table Columns 3" w:semiHidden="1" w:unhideWhenUsed="1"/>
+    <w:lsdException w:name="Table Columns 4" w:semiHidden="1" w:unhideWhenUsed="1"/>
+    <w:lsdException w:name="Table Columns 5" w:semiHidden="1" w:unhideWhenUsed="1"/>
+    <w:lsdException w:name="Table Grid 1" w:semiHidden="1" w:unhideWhenUsed="1"/>
+    <w:lsdException w:name="Table Grid 2" w:semiHidden="1" w:unhideWhenUsed="1"/>
+    <w:lsdException w:name="Table Grid 3" w:semiHidden="1" w:unhideWhenUsed="1"/>
+    <w:lsdException w:name="Table Grid 4" w:semiHidden="1" w:unhideWhenUsed="1"/>
+    <w:lsdException w:name="Table Grid 5" w:semiHidden="1" w:unhideWhenUsed="1"/>
+    <w:lsdException w:name="Table Grid 6" w:semiHidden="1" w:unhideWhenUsed="1"/>
+    <w:lsdException w:name="Table Grid 7" w:semiHidden="1" w:unhideWhenUsed="1"/>
+    <w:lsdException w:name="Table Grid 8" w:semiHidden="1" w:unhideWhenUsed="1"/>
+    <w:lsdException w:name="Table List 1" w:semiHidden="1" w:unhideWhenUsed="1"/>
+    <w:lsdException w:name="Table List 2" w:semiHidden="1" w:unhideWhenUsed="1"/>
+    <w:lsdException w:name="Table List 3" w:semiHidden="1" w:unhideWhenUsed="1"/>
+    <w:lsdException w:name="Table List 4" w:semiHidden="1" w:unhideWhenUsed="1"/>
+    <w:lsdException w:name="Table List 5" w:semiHidden="1" w:unhideWhenUsed="1"/>
+    <w:lsdException w:name="Table List 6" w:semiHidden="1" w:unhideWhenUsed="1"/>
+    <w:lsdException w:name="Table List 7" w:semiHidden="1" w:unhideWhenUsed="1"/>
+    <w:lsdException w:name="Table List 8" w:semiHidden="1" w:unhideWhenUsed="1"/>
+    <w:lsdException w:name="Table 3D effects 1" w:semiHidden="1" w:unhideWhenUsed="1"/>
+    <w:lsdException w:name="Table 3D effects 2" w:semiHidden="1" w:unhideWhenUsed="1"/>
+    <w:lsdException w:name="Table 3D effects 3" w:semiHidden="1" w:unhideWhenUsed="1"/>
+    <w:lsdException w:name="Table Contemporary" w:semiHidden="1" w:unhideWhenUsed="1"/>
+    <w:lsdException w:name="Table Elegant" w:semiHidden="1" w:unhideWhenUsed="1"/>
+    <w:lsdException w:name="Table Professional" w:semiHidden="1" w:unhideWhenUsed="1"/>
+    <w:lsdException w:name="Table Subtle 1" w:semiHidden="1" w:unhideWhenUsed="1"/>
+    <w:lsdException w:name="Table Subtle 2" w:semiHidden="1" w:unhideWhenUsed="1"/>
+    <w:lsdException w:name="Table Web 1" w:semiHidden="1" w:unhideWhenUsed="1"/>
+    <w:lsdException w:name="Table Web 2" w:semiHidden="1" w:unhideWhenUsed="1"/>
+    <w:lsdException w:name="Table Web 3" w:semiHidden="1" w:unhideWhenUsed="1"/>
+    <w:lsdException w:name="Balloon Text" w:semiHidden="1" w:unhideWhenUsed="1"/>
+    <w:lsdException w:name="Table Grid" w:semiHidden="1" w:uiPriority="59" w:unhideWhenUsed="1"/>
+    <w:lsdException w:name="Table Theme" w:semiHidden="1" w:unhideWhenUsed="1"/>
+    <w:lsdException w:name="Placeholder Text" w:semiHidden="1"/>
+    <w:lsdException w:name="No Spacing" w:uiPriority="1" w:qFormat="1"/>
+    <w:lsdException w:name="Light Shading" w:uiPriority="60"/>
+    <w:lsdException w:name="Light List" w:uiPriority="61"/>
+    <w:lsdException w:name="Light Grid" w:uiPriority="62"/>
+    <w:lsdException w:name="Medium Shading 1" w:uiPriority="63"/>
+    <w:lsdException w:name="Medium Shading 2" w:uiPriority="64"/>
+    <w:lsdException w:name="Medium List 1" w:uiPriority="65"/>
+    <w:lsdException w:name="Medium List 2" w:uiPriority="66"/>
+    <w:lsdException w:name="Medium Grid 1" w:uiPriority="67"/>
+    <w:lsdException w:name="Medium Grid 2" w:uiPriority="68"/>
+    <w:lsdException w:name="Medium Grid 3" w:uiPriority="69"/>
+    <w:lsdException w:name="Dark List" w:uiPriority="70"/>
+    <w:lsdException w:name="Colorful Shading" w:uiPriority="71"/>
+    <w:lsdException w:name="Colorful List" w:uiPriority="72"/>
+    <w:lsdException w:name="Colorful Grid" w:uiPriority="73"/>
+    <w:lsdException w:name="Light Shading Accent 1" w:uiPriority="60"/>
+    <w:lsdException w:name="Light List Accent 1" w:uiPriority="61"/>
+    <w:lsdException w:name="Light Grid Accent 1" w:uiPriority="62"/>
+    <w:lsdException w:name="Medium Shading 1 Accent 1" w:uiPriority="63"/>
+    <w:lsdException w:name="Medium Shading 2 Accent 1" w:uiPriority="64"/>
+    <w:lsdException w:name="Medium List 1 Accent 1" w:uiPriority="65"/>
+    <w:lsdException w:name="Revision" w:semiHidden="1"/>
+    <w:lsdException w:name="List Paragraph" w:uiPriority="34" w:qFormat="1"/>
+    <w:lsdException w:name="Quote" w:uiPriority="29" w:qFormat="1"/>
+    <w:lsdException w:name="Intense Quote" w:uiPriority="30" w:qFormat="1"/>
+    <w:lsdException w:name="Medium List 2 Accent 1" w:uiPriority="66"/>
+    <w:lsdException w:name="Medium Grid 1 Accent 1" w:uiPriority="67"/>
+    <w:lsdException w:name="Medium Grid 2 Accent 1" w:uiPriority="68"/>
+    <w:lsdException w:name="Medium Grid 3 Accent 1" w:uiPriority="69"/>
+    <w:lsdException w:name="Dark List Accent 1" w:uiPriority="70"/>
+    <w:lsdException w:name="Colorful Shading Accent 1" w:uiPriority="71"/>
+    <w:lsdException w:name="Colorful List Accent 1" w:uiPriority="72"/>
+    <w:lsdException w:name="Colorful Grid Accent 1" w:uiPriority="73"/>
+    <w:lsdException w:name="Light Shading Accent 2" w:uiPriority="60"/>
+    <w:lsdException w:name="Light List Accent 2" w:uiPriority="61"/>
+    <w:lsdException w:name="Light Grid Accent 2" w:uiPriority="62"/>
+    <w:lsdException w:name="Medium Shading 1 Accent 2" w:uiPriority="63"/>
+    <w:lsdException w:name="Medium Shading 2 Accent 2" w:uiPriority="64"/>
+    <w:lsdException w:name="Medium List 1 Accent 2" w:uiPriority="65"/>
+    <w:lsdException w:name="Medium List 2 Accent 2" w:uiPriority="66"/>
+    <w:lsdException w:name="Medium Grid 1 Accent 2" w:uiPriority="67"/>
+    <w:lsdException w:name="Medium Grid 2 Accent 2" w:uiPriority="68"/>
+    <w:lsdException w:name="Medium Grid 3 Accent 2" w:uiPriority="69"/>
+    <w:lsdException w:name="Dark List Accent 2" w:uiPriority="70"/>
+    <w:lsdException w:name="Colorful Shading Accent 2" w:uiPriority="71"/>
+    <w:lsdException w:name="Colorful List Accent 2" w:uiPriority="72"/>
+    <w:lsdException w:name="Colorful Grid Accent 2" w:uiPriority="73"/>
+    <w:lsdException w:name="Light Shading Accent 3" w:uiPriority="60"/>
+    <w:lsdException w:name="Light List Accent 3" w:uiPriority="61"/>
+    <w:lsdException w:name="Light Grid Accent 3" w:uiPriority="62"/>
+    <w:lsdException w:name="Medium Shading 1 Accent 3" w:uiPriority="63"/>
+    <w:lsdException w:name="Medium Shading 2 Accent 3" w:uiPriority="64"/>
+    <w:lsdException w:name="Medium List 1 Accent 3" w:uiPriority="65"/>
+    <w:lsdException w:name="Medium List 2 Accent 3" w:uiPriority="66"/>
+    <w:lsdException w:name="Medium Grid 1 Accent 3" w:uiPriority="67"/>
+    <w:lsdException w:name="Medium Grid 2 Accent 3" w:uiPriority="68"/>
+    <w:lsdException w:name="Medium Grid 3 Accent 3" w:uiPriority="69"/>
+    <w:lsdException w:name="Dark List Accent 3" w:uiPriority="70"/>
+    <w:lsdException w:name="Colorful Shading Accent 3" w:uiPriority="71"/>
+    <w:lsdException w:name="Colorful List Accent 3" w:uiPriority="72"/>
+    <w:lsdException w:name="Colorful Grid Accent 3" w:uiPriority="73"/>
+    <w:lsdException w:name="Light Shading Accent 4" w:uiPriority="60"/>
+    <w:lsdException w:name="Light List Accent 4" w:uiPriority="61"/>
+    <w:lsdException w:name="Light Grid Accent 4" w:uiPriority="62"/>
+    <w:lsdException w:name="Medium Shading 1 Accent 4" w:uiPriority="63"/>
+    <w:lsdException w:name="Medium Shading 2 Accent 4" w:uiPriority="64"/>
+    <w:lsdException w:name="Medium List 1 Accent 4" w:uiPriority="65"/>
+    <w:lsdException w:name="Medium List 2 Accent 4" w:uiPriority="66"/>
+    <w:lsdException w:name="Medium Grid 1 Accent 4" w:uiPriority="67"/>
+    <w:lsdException w:name="Medium Grid 2 Accent 4" w:uiPriority="68"/>
+    <w:lsdException w:name="Medium Grid 3 Accent 4" w:uiPriority="69"/>
+    <w:lsdException w:name="Dark List Accent 4" w:uiPriority="70"/>
+    <w:lsdException w:name="Colorful Shading Accent 4" w:uiPriority="71"/>
+    <w:lsdException w:name="Colorful List Accent 4" w:uiPriority="72"/>
+    <w:lsdException w:name="Colorful Grid Accent 4" w:uiPriority="73"/>
+    <w:lsdException w:name="Light Shading Accent 5" w:uiPriority="60"/>
+    <w:lsdException w:name="Light List Accent 5" w:uiPriority="61"/>
+    <w:lsdException w:name="Light Grid Accent 5" w:uiPriority="62"/>
+    <w:lsdException w:name="Medium Shading 1 Accent 5" w:uiPriority="63"/>
+    <w:lsdException w:name="Medium Shading 2 Accent 5" w:uiPriority="64"/>
+    <w:lsdException w:name="Medium List 1 Accent 5" w:uiPriority="65"/>
+    <w:lsdException w:name="Medium List 2 Accent 5" w:uiPriority="66"/>
+    <w:lsdException w:name="Medium Grid 1 Accent 5" w:uiPriority="67"/>
+    <w:lsdException w:name="Medium Grid 2 Accent 5" w:uiPriority="68"/>
+    <w:lsdException w:name="Medium Grid 3 Accent 5" w:uiPriority="69"/>
+    <w:lsdException w:name="Dark List Accent 5" w:uiPriority="70"/>
+    <w:lsdException w:name="Colorful Shading Accent 5" w:uiPriority="71"/>
+    <w:lsdException w:name="Colorful List Accent 5" w:uiPriority="72"/>
+    <w:lsdException w:name="Colorful Grid Accent 5" w:uiPriority="73"/>
+    <w:lsdException w:name="Light Shading Accent 6" w:uiPriority="60"/>
+    <w:lsdException w:name="Light List Accent 6" w:uiPriority="61"/>
+    <w:lsdException w:name="Light Grid Accent 6" w:uiPriority="62"/>
+    <w:lsdException w:name="Medium Shading 1 Accent 6" w:uiPriority="63"/>
+    <w:lsdException w:name="Medium Shading 2 Accent 6" w:uiPriority="64"/>
+    <w:lsdException w:name="Medium List 1 Accent 6" w:uiPriority="65"/>
+    <w:lsdException w:name="Medium List 2 Accent 6" w:uiPriority="66"/>
+    <w:lsdException w:name="Medium Grid 1 Accent 6" w:uiPriority="67"/>
+    <w:lsdException w:name="Medium Grid 2 Accent 6" w:uiPriority="68"/>
+    <w:lsdException w:name="Medium Grid 3 Accent 6" w:uiPriority="69"/>
+    <w:lsdException w:name="Dark List Accent 6" w:uiPriority="70"/>
+    <w:lsdException w:name="Colorful Shading Accent 6" w:uiPriority="71"/>
+    <w:lsdException w:name="Colorful List Accent 6" w:uiPriority="72"/>
+    <w:lsdException w:name="Colorful Grid Accent 6" w:uiPriority="73"/>
+    <w:lsdException w:name="Subtle Emphasis" w:uiPriority="19" w:qFormat="1"/>
+    <w:lsdException w:name="Intense Emphasis" w:uiPriority="21" w:qFormat="1"/>
+    <w:lsdException w:name="Subtle Reference" w:uiPriority="31" w:qFormat="1"/>
+    <w:lsdException w:name="Intense Reference" w:uiPriority="32" w:qFormat="1"/>
+    <w:lsdException w:name="Book Title" w:uiPriority="33" w:qFormat="1"/>
+    <w:lsdException w:name="Bibliography" w:semiHidden="1" w:uiPriority="37" w:unhideWhenUsed="1"/>
+    <w:lsdException w:name="TOC Heading" w:semiHidden="1" w:uiPriority="39" w:unhideWhenUsed="1" w:qFormat="1"/>
+    <w:lsdException w:name="Plain Table 1" w:uiPriority="41"/>
+    <w:lsdException w:name="Plain Table 2" w:uiPriority="42"/>
+    <w:lsdException w:name="Plain Table 3" w:uiPriority="43"/>
+    <w:lsdException w:name="Plain Table 4" w:uiPriority="44"/>
+    <w:lsdException w:name="Plain Table 5" w:uiPriority="45"/>
+    <w:lsdException w:name="Grid Table Light" w:uiPriority="40"/>
+    <w:lsdException w:name="Grid Table 1 Light" w:uiPriority="46"/>
+    <w:lsdException w:name="Grid Table 2" w:uiPriority="47"/>
+    <w:lsdException w:name="Grid Table 3" w:uiPriority="48"/>
+    <w:lsdException w:name="Grid Table 4" w:uiPriority="49"/>
+    <w:lsdException w:name="Grid Table 5 Dark" w:uiPriority="50"/>
+    <w:lsdException w:name="Grid Table 6 Colorful" w:uiPriority="51"/>
+    <w:lsdException w:name="Grid Table 7 Colorful" w:uiPriority="52"/>
+    <w:lsdException w:name="Grid Table 1 Light Accent 1" w:uiPriority="46"/>
+    <w:lsdException w:name="Grid Table 2 Accent 1" w:uiPriority="47"/>
+    <w:lsdException w:name="Grid Table 3 Accent 1" w:uiPriority="48"/>
+    <w:lsdException w:name="Grid Table 4 Accent 1" w:uiPriority="49"/>
+    <w:lsdException w:name="Grid Table 5 Dark Accent 1" w:uiPriority="50"/>
+    <w:lsdException w:name="Grid Table 6 Colorful Accent 1" w:uiPriority="51"/>
+    <w:lsdException w:name="Grid Table 7 Colorful Accent 1" w:uiPriority="52"/>
+    <w:lsdException w:name="Grid Table 1 Light Accent 2" w:uiPriority="46"/>
+    <w:lsdException w:name="Grid Table 2 Accent 2" w:uiPriority="47"/>
+    <w:lsdException w:name="Grid Table 3 Accent 2" w:uiPriority="48"/>
+    <w:lsdException w:name="Grid Table 4 Accent 2" w:uiPriority="49"/>
+    <w:lsdException w:name="Grid Table 5 Dark Accent 2" w:uiPriority="50"/>
+    <w:lsdException w:name="Grid Table 6 Colorful Accent 2" w:uiPriority="51"/>
+    <w:lsdException w:name="Grid Table 7 Colorful Accent 2" w:uiPriority="52"/>
+    <w:lsdException w:name="Grid Table 1 Light Accent 3" w:uiPriority="46"/>
+    <w:lsdException w:name="Grid Table 2 Accent 3" w:uiPriority="47"/>
+    <w:lsdException w:name="Grid Table 3 Accent 3" w:uiPriority="48"/>
+    <w:lsdException w:name="Grid Table 4 Accent 3" w:uiPriority="49"/>
+    <w:lsdException w:name="Grid Table 5 Dark Accent 3" w:uiPriority="50"/>
+    <w:lsdException w:name="Grid Table 6 Colorful Accent 3" w:uiPriority="51"/>
+    <w:lsdException w:name="Grid Table 7 Colorful Accent 3" w:uiPriority="52"/>
+    <w:lsdException w:name="Grid Table 1 Light Accent 4" w:uiPriority="46"/>
+    <w:lsdException w:name="Grid Table 2 Accent 4" w:uiPriority="47"/>
+    <w:lsdException w:name="Grid Table 3 Accent 4" w:uiPriority="48"/>
+    <w:lsdException w:name="Grid Table 4 Accent 4" w:uiPriority="49"/>
+    <w:lsdException w:name="Grid Table 5 Dark Accent 4" w:uiPriority="50"/>
+    <w:lsdException w:name="Grid Table 6 Colorful Accent 4" w:uiPriority="51"/>
+    <w:lsdException w:name="Grid Table 7 Colorful Accent 4" w:uiPriority="52"/>
+    <w:lsdException w:name="Grid Table 1 Light Accent 5" w:uiPriority="46"/>
+    <w:lsdException w:name="Grid Table 2 Accent 5" w:uiPriority="47"/>
+    <w:lsdException w:name="Grid Table 3 Accent 5" w:uiPriority="48"/>
+    <w:lsdException w:name="Grid Table 4 Accent 5" w:uiPriority="49"/>
+    <w:lsdException w:name="Grid Table 5 Dark Accent 5" w:uiPriority="50"/>
+    <w:lsdException w:name="Grid Table 6 Colorful Accent 5" w:uiPriority="51"/>
+    <w:lsdException w:name="Grid Table 7 Colorful Accent 5" w:uiPriority="52"/>
+    <w:lsdException w:name="Grid Table 1 Light Accent 6" w:uiPriority="46"/>
+    <w:lsdException w:name="Grid Table 2 Accent 6" w:uiPriority="47"/>
+    <w:lsdException w:name="Grid Table 3 Accent 6" w:uiPriority="48"/>
+    <w:lsdException w:name="Grid Table 4 Accent 6" w:uiPriority="49"/>
+    <w:lsdException w:name="Grid Table 5 Dark Accent 6" w:uiPriority="50"/>
+    <w:lsdException w:name="Grid Table 6 Colorful Accent 6" w:uiPriority="51"/>
+    <w:lsdException w:name="Grid Table 7 Colorful Accent 6" w:uiPriority="52"/>
+    <w:lsdException w:name="List Table 1 Light" w:uiPriority="46"/>
+    <w:lsdException w:name="List Table 2" w:uiPriority="47"/>
+    <w:lsdException w:name="List Table 3" w:uiPriority="48"/>
+    <w:lsdException w:name="List Table 4" w:uiPriority="49"/>
+    <w:lsdException w:name="List Table 5 Dark" w:uiPriority="50"/>
+    <w:lsdException w:name="List Table 6 Colorful" w:uiPriority="51"/>
+    <w:lsdException w:name="List Table 7 Colorful" w:uiPriority="52"/>
+    <w:lsdException w:name="List Table 1 Light Accent 1" w:uiPriority="46"/>
+    <w:lsdException w:name="List Table 2 Accent 1" w:uiPriority="47"/>
+    <w:lsdException w:name="List Table 3 Accent 1" w:uiPriority="48"/>
+    <w:lsdException w:name="List Table 4 Accent 1" w:uiPriority="49"/>
+    <w:lsdException w:name="List Table 5 Dark Accent 1" w:uiPriority="50"/>
+    <w:lsdException w:name="List Table 6 Colorful Accent 1" w:uiPriority="51"/>
+    <w:lsdException w:name="List Table 7 Colorful Accent 1" w:uiPriority="52"/>
+    <w:lsdException w:name="List Table 1 Light Accent 2" w:uiPriority="46"/>
+    <w:lsdException w:name="List Table 2 Accent 2" w:uiPriority="47"/>
+    <w:lsdException w:name="List Table 3 Accent 2" w:uiPriority="48"/>
+    <w:lsdException w:name="List Table 4 Accent 2" w:uiPriority="49"/>
+    <w:lsdException w:name="List Table 5 Dark Accent 2" w:uiPriority="50"/>
+    <w:lsdException w:name="List Table 6 Colorful Accent 2" w:uiPriority="51"/>
+    <w:lsdException w:name="List Table 7 Colorful Accent 2" w:uiPriority="52"/>
+    <w:lsdException w:name="List Table 1 Light Accent 3" w:uiPriority="46"/>
+    <w:lsdException w:name="List Table 2 Accent 3" w:uiPriority="47"/>
+    <w:lsdException w:name="List Table 3 Accent 3" w:uiPriority="48"/>
+    <w:lsdException w:name="List Table 4 Accent 3" w:uiPriority="49"/>
+    <w:lsdException w:name="List Table 5 Dark Accent 3" w:uiPriority="50"/>
+    <w:lsdException w:name="List Table 6 Colorful Accent 3" w:uiPriority="51"/>
+    <w:lsdException w:name="List Table 7 Colorful Accent 3" w:uiPriority="52"/>
+    <w:lsdException w:name="List Table 1 Light Accent 4" w:uiPriority="46"/>
+    <w:lsdException w:name="List Table 2 Accent 4" w:uiPriority="47"/>
+    <w:lsdException w:name="List Table 3 Accent 4" w:uiPriority="48"/>
+    <w:lsdException w:name="List Table 4 Accent 4" w:uiPriority="49"/>
+    <w:lsdException w:name="List Table 5 Dark Accent 4" w:uiPriority="50"/>
+    <w:lsdException w:name="List Table 6 Colorful Accent 4" w:uiPriority="51"/>
+    <w:lsdException w:name="List Table 7 Colorful Accent 4" w:uiPriority="52"/>
+    <w:lsdException w:name="List Table 1 Light Accent 5" w:uiPriority="46"/>
+    <w:lsdException w:name="List Table 2 Accent 5" w:uiPriority="47"/>
+    <w:lsdException w:name="List Table 3 Accent 5" w:uiPriority="48"/>
+    <w:lsdException w:name="List Table 4 Accent 5" w:uiPriority="49"/>
+    <w:lsdException w:name="List Table 5 Dark Accent 5" w:uiPriority="50"/>
+    <w:lsdException w:name="List Table 6 Colorful Accent 5" w:uiPriority="51"/>
+    <w:lsdException w:name="List Table 7 Colorful Accent 5" w:uiPriority="52"/>
+    <w:lsdException w:name="List Table 1 Light Accent 6" w:uiPriority="46"/>
+    <w:lsdException w:name="List Table 2 Accent 6" w:uiPriority="47"/>
+    <w:lsdException w:name="List Table 3 Accent 6" w:uiPriority="48"/>
+    <w:lsdException w:name="List Table 4 Accent 6" w:uiPriority="49"/>
+    <w:lsdException w:name="List Table 5 Dark Accent 6" w:uiPriority="50"/>
+    <w:lsdException w:name="List Table 6 Colorful Accent 6" w:uiPriority="51"/>
+    <w:lsdException w:name="List Table 7 Colorful Accent 6" w:uiPriority="52"/>
+    <w:lsdException w:name="Mention" w:semiHidden="1" w:unhideWhenUsed="1"/>
+    <w:lsdException w:name="Smart Hyperlink" w:semiHidden="1" w:unhideWhenUsed="1"/>
+    <w:lsdException w:name="Hashtag" w:semiHidden="1" w:unhideWhenUsed="1"/>
+    <w:lsdException w:name="Unresolved Mention" w:semiHidden="1" w:unhideWhenUsed="1"/>
+    <w:lsdException w:name="Smart Link" w:semiHidden="1" w:unhideWhenUsed="1"/>
   </w:latentStyles>
   <w:style w:type="paragraph" w:default="1" w:styleId="a">
     <w:name w:val="Normal"/>
@@ -11734,234 +12661,18 @@
       <w:iCs/>
     </w:rPr>
   </w:style>
-</w:styles>
-</file>
-
-<file path=word/stylesWithEffects.xml><?xml version="1.0" encoding="utf-8"?>
-<w:styles xmlns:wpc="http://schemas.microsoft.com/office/word/2010/wordprocessingCanvas" xmlns:mc="http://schemas.openxmlformats.org/markup-compatibility/2006" xmlns:o="urn:schemas-microsoft-com:office:office" xmlns:r="http://schemas.openxmlformats.org/officeDocument/2006/relationships" xmlns:m="http://schemas.openxmlformats.org/officeDocument/2006/math" xmlns:v="urn:schemas-microsoft-com:vml" xmlns:wp14="http://schemas.microsoft.com/office/word/2010/wordprocessingDrawing" xmlns:wp="http://schemas.openxmlformats.org/drawingml/2006/wordprocessingDrawing" xmlns:w10="urn:schemas-microsoft-com:office:word" xmlns:w="http://schemas.openxmlformats.org/wordprocessingml/2006/main" xmlns:w14="http://schemas.microsoft.com/office/word/2010/wordml" xmlns:wpg="http://schemas.microsoft.com/office/word/2010/wordprocessingGroup" xmlns:wpi="http://schemas.microsoft.com/office/word/2010/wordprocessingInk" xmlns:wne="http://schemas.microsoft.com/office/word/2006/wordml" xmlns:wps="http://schemas.microsoft.com/office/word/2010/wordprocessingShape" mc:Ignorable="w14 wp14">
-  <w:docDefaults>
-    <w:rPrDefault>
-      <w:rPr>
-        <w:rFonts w:asciiTheme="minorHAnsi" w:eastAsiaTheme="minorHAnsi" w:hAnsiTheme="minorHAnsi" w:cstheme="minorBidi"/>
-        <w:sz w:val="22"/>
-        <w:szCs w:val="22"/>
-        <w:lang w:val="ru-RU" w:eastAsia="en-US" w:bidi="ar-SA"/>
-      </w:rPr>
-    </w:rPrDefault>
-    <w:pPrDefault>
-      <w:pPr>
-        <w:spacing w:after="200" w:line="276" w:lineRule="auto"/>
-      </w:pPr>
-    </w:pPrDefault>
-  </w:docDefaults>
-  <w:latentStyles w:defLockedState="0" w:defUIPriority="99" w:defSemiHidden="1" w:defUnhideWhenUsed="1" w:defQFormat="0" w:count="267">
-    <w:lsdException w:name="Normal" w:semiHidden="0" w:uiPriority="0" w:unhideWhenUsed="0" w:qFormat="1"/>
-    <w:lsdException w:name="heading 1" w:semiHidden="0" w:uiPriority="9" w:unhideWhenUsed="0" w:qFormat="1"/>
-    <w:lsdException w:name="heading 2" w:uiPriority="9" w:qFormat="1"/>
-    <w:lsdException w:name="heading 3" w:uiPriority="9" w:qFormat="1"/>
-    <w:lsdException w:name="heading 4" w:uiPriority="9" w:qFormat="1"/>
-    <w:lsdException w:name="heading 5" w:uiPriority="9" w:qFormat="1"/>
-    <w:lsdException w:name="heading 6" w:uiPriority="9" w:qFormat="1"/>
-    <w:lsdException w:name="heading 7" w:uiPriority="9" w:qFormat="1"/>
-    <w:lsdException w:name="heading 8" w:uiPriority="9" w:qFormat="1"/>
-    <w:lsdException w:name="heading 9" w:uiPriority="9" w:qFormat="1"/>
-    <w:lsdException w:name="toc 1" w:uiPriority="39"/>
-    <w:lsdException w:name="toc 2" w:uiPriority="39"/>
-    <w:lsdException w:name="toc 3" w:uiPriority="39"/>
-    <w:lsdException w:name="toc 4" w:uiPriority="39"/>
-    <w:lsdException w:name="toc 5" w:uiPriority="39"/>
-    <w:lsdException w:name="toc 6" w:uiPriority="39"/>
-    <w:lsdException w:name="toc 7" w:uiPriority="39"/>
-    <w:lsdException w:name="toc 8" w:uiPriority="39"/>
-    <w:lsdException w:name="toc 9" w:uiPriority="39"/>
-    <w:lsdException w:name="caption" w:uiPriority="35" w:qFormat="1"/>
-    <w:lsdException w:name="Title" w:semiHidden="0" w:uiPriority="10" w:unhideWhenUsed="0" w:qFormat="1"/>
-    <w:lsdException w:name="Default Paragraph Font" w:uiPriority="1"/>
-    <w:lsdException w:name="Subtitle" w:semiHidden="0" w:uiPriority="11" w:unhideWhenUsed="0" w:qFormat="1"/>
-    <w:lsdException w:name="Strong" w:semiHidden="0" w:uiPriority="22" w:unhideWhenUsed="0" w:qFormat="1"/>
-    <w:lsdException w:name="Emphasis" w:semiHidden="0" w:uiPriority="20" w:unhideWhenUsed="0" w:qFormat="1"/>
-    <w:lsdException w:name="Table Grid" w:semiHidden="0" w:uiPriority="59" w:unhideWhenUsed="0"/>
-    <w:lsdException w:name="Placeholder Text" w:unhideWhenUsed="0"/>
-    <w:lsdException w:name="No Spacing" w:semiHidden="0" w:uiPriority="1" w:unhideWhenUsed="0" w:qFormat="1"/>
-    <w:lsdException w:name="Light Shading" w:semiHidden="0" w:uiPriority="60" w:unhideWhenUsed="0"/>
-    <w:lsdException w:name="Light List" w:semiHidden="0" w:uiPriority="61" w:unhideWhenUsed="0"/>
-    <w:lsdException w:name="Light Grid" w:semiHidden="0" w:uiPriority="62" w:unhideWhenUsed="0"/>
-    <w:lsdException w:name="Medium Shading 1" w:semiHidden="0" w:uiPriority="63" w:unhideWhenUsed="0"/>
-    <w:lsdException w:name="Medium Shading 2" w:semiHidden="0" w:uiPriority="64" w:unhideWhenUsed="0"/>
-    <w:lsdException w:name="Medium List 1" w:semiHidden="0" w:uiPriority="65" w:unhideWhenUsed="0"/>
-    <w:lsdException w:name="Medium List 2" w:semiHidden="0" w:uiPriority="66" w:unhideWhenUsed="0"/>
-    <w:lsdException w:name="Medium Grid 1" w:semiHidden="0" w:uiPriority="67" w:unhideWhenUsed="0"/>
-    <w:lsdException w:name="Medium Grid 2" w:semiHidden="0" w:uiPriority="68" w:unhideWhenUsed="0"/>
-    <w:lsdException w:name="Medium Grid 3" w:semiHidden="0" w:uiPriority="69" w:unhideWhenUsed="0"/>
-    <w:lsdException w:name="Dark List" w:semiHidden="0" w:uiPriority="70" w:unhideWhenUsed="0"/>
-    <w:lsdException w:name="Colorful Shading" w:semiHidden="0" w:uiPriority="71" w:unhideWhenUsed="0"/>
-    <w:lsdException w:name="Colorful List" w:semiHidden="0" w:uiPriority="72" w:unhideWhenUsed="0"/>
-    <w:lsdException w:name="Colorful Grid" w:semiHidden="0" w:uiPriority="73" w:unhideWhenUsed="0"/>
-    <w:lsdException w:name="Light Shading Accent 1" w:semiHidden="0" w:uiPriority="60" w:unhideWhenUsed="0"/>
-    <w:lsdException w:name="Light List Accent 1" w:semiHidden="0" w:uiPriority="61" w:unhideWhenUsed="0"/>
-    <w:lsdException w:name="Light Grid Accent 1" w:semiHidden="0" w:uiPriority="62" w:unhideWhenUsed="0"/>
-    <w:lsdException w:name="Medium Shading 1 Accent 1" w:semiHidden="0" w:uiPriority="63" w:unhideWhenUsed="0"/>
-    <w:lsdException w:name="Medium Shading 2 Accent 1" w:semiHidden="0" w:uiPriority="64" w:unhideWhenUsed="0"/>
-    <w:lsdException w:name="Medium List 1 Accent 1" w:semiHidden="0" w:uiPriority="65" w:unhideWhenUsed="0"/>
-    <w:lsdException w:name="Revision" w:unhideWhenUsed="0"/>
-    <w:lsdException w:name="List Paragraph" w:semiHidden="0" w:uiPriority="34" w:unhideWhenUsed="0" w:qFormat="1"/>
-    <w:lsdException w:name="Quote" w:semiHidden="0" w:uiPriority="29" w:unhideWhenUsed="0" w:qFormat="1"/>
-    <w:lsdException w:name="Intense Quote" w:semiHidden="0" w:uiPriority="30" w:unhideWhenUsed="0" w:qFormat="1"/>
-    <w:lsdException w:name="Medium List 2 Accent 1" w:semiHidden="0" w:uiPriority="66" w:unhideWhenUsed="0"/>
-    <w:lsdException w:name="Medium Grid 1 Accent 1" w:semiHidden="0" w:uiPriority="67" w:unhideWhenUsed="0"/>
-    <w:lsdException w:name="Medium Grid 2 Accent 1" w:semiHidden="0" w:uiPriority="68" w:unhideWhenUsed="0"/>
-    <w:lsdException w:name="Medium Grid 3 Accent 1" w:semiHidden="0" w:uiPriority="69" w:unhideWhenUsed="0"/>
-    <w:lsdException w:name="Dark List Accent 1" w:semiHidden="0" w:uiPriority="70" w:unhideWhenUsed="0"/>
-    <w:lsdException w:name="Colorful Shading Accent 1" w:semiHidden="0" w:uiPriority="71" w:unhideWhenUsed="0"/>
-    <w:lsdException w:name="Colorful List Accent 1" w:semiHidden="0" w:uiPriority="72" w:unhideWhenUsed="0"/>
-    <w:lsdException w:name="Colorful Grid Accent 1" w:semiHidden="0" w:uiPriority="73" w:unhideWhenUsed="0"/>
-    <w:lsdException w:name="Light Shading Accent 2" w:semiHidden="0" w:uiPriority="60" w:unhideWhenUsed="0"/>
-    <w:lsdException w:name="Light List Accent 2" w:semiHidden="0" w:uiPriority="61" w:unhideWhenUsed="0"/>
-    <w:lsdException w:name="Light Grid Accent 2" w:semiHidden="0" w:uiPriority="62" w:unhideWhenUsed="0"/>
-    <w:lsdException w:name="Medium Shading 1 Accent 2" w:semiHidden="0" w:uiPriority="63" w:unhideWhenUsed="0"/>
-    <w:lsdException w:name="Medium Shading 2 Accent 2" w:semiHidden="0" w:uiPriority="64" w:unhideWhenUsed="0"/>
-    <w:lsdException w:name="Medium List 1 Accent 2" w:semiHidden="0" w:uiPriority="65" w:unhideWhenUsed="0"/>
-    <w:lsdException w:name="Medium List 2 Accent 2" w:semiHidden="0" w:uiPriority="66" w:unhideWhenUsed="0"/>
-    <w:lsdException w:name="Medium Grid 1 Accent 2" w:semiHidden="0" w:uiPriority="67" w:unhideWhenUsed="0"/>
-    <w:lsdException w:name="Medium Grid 2 Accent 2" w:semiHidden="0" w:uiPriority="68" w:unhideWhenUsed="0"/>
-    <w:lsdException w:name="Medium Grid 3 Accent 2" w:semiHidden="0" w:uiPriority="69" w:unhideWhenUsed="0"/>
-    <w:lsdException w:name="Dark List Accent 2" w:semiHidden="0" w:uiPriority="70" w:unhideWhenUsed="0"/>
-    <w:lsdException w:name="Colorful Shading Accent 2" w:semiHidden="0" w:uiPriority="71" w:unhideWhenUsed="0"/>
-    <w:lsdException w:name="Colorful List Accent 2" w:semiHidden="0" w:uiPriority="72" w:unhideWhenUsed="0"/>
-    <w:lsdException w:name="Colorful Grid Accent 2" w:semiHidden="0" w:uiPriority="73" w:unhideWhenUsed="0"/>
-    <w:lsdException w:name="Light Shading Accent 3" w:semiHidden="0" w:uiPriority="60" w:unhideWhenUsed="0"/>
-    <w:lsdException w:name="Light List Accent 3" w:semiHidden="0" w:uiPriority="61" w:unhideWhenUsed="0"/>
-    <w:lsdException w:name="Light Grid Accent 3" w:semiHidden="0" w:uiPriority="62" w:unhideWhenUsed="0"/>
-    <w:lsdException w:name="Medium Shading 1 Accent 3" w:semiHidden="0" w:uiPriority="63" w:unhideWhenUsed="0"/>
-    <w:lsdException w:name="Medium Shading 2 Accent 3" w:semiHidden="0" w:uiPriority="64" w:unhideWhenUsed="0"/>
-    <w:lsdException w:name="Medium List 1 Accent 3" w:semiHidden="0" w:uiPriority="65" w:unhideWhenUsed="0"/>
-    <w:lsdException w:name="Medium List 2 Accent 3" w:semiHidden="0" w:uiPriority="66" w:unhideWhenUsed="0"/>
-    <w:lsdException w:name="Medium Grid 1 Accent 3" w:semiHidden="0" w:uiPriority="67" w:unhideWhenUsed="0"/>
-    <w:lsdException w:name="Medium Grid 2 Accent 3" w:semiHidden="0" w:uiPriority="68" w:unhideWhenUsed="0"/>
-    <w:lsdException w:name="Medium Grid 3 Accent 3" w:semiHidden="0" w:uiPriority="69" w:unhideWhenUsed="0"/>
-    <w:lsdException w:name="Dark List Accent 3" w:semiHidden="0" w:uiPriority="70" w:unhideWhenUsed="0"/>
-    <w:lsdException w:name="Colorful Shading Accent 3" w:semiHidden="0" w:uiPriority="71" w:unhideWhenUsed="0"/>
-    <w:lsdException w:name="Colorful List Accent 3" w:semiHidden="0" w:uiPriority="72" w:unhideWhenUsed="0"/>
-    <w:lsdException w:name="Colorful Grid Accent 3" w:semiHidden="0" w:uiPriority="73" w:unhideWhenUsed="0"/>
-    <w:lsdException w:name="Light Shading Accent 4" w:semiHidden="0" w:uiPriority="60" w:unhideWhenUsed="0"/>
-    <w:lsdException w:name="Light List Accent 4" w:semiHidden="0" w:uiPriority="61" w:unhideWhenUsed="0"/>
-    <w:lsdException w:name="Light Grid Accent 4" w:semiHidden="0" w:uiPriority="62" w:unhideWhenUsed="0"/>
-    <w:lsdException w:name="Medium Shading 1 Accent 4" w:semiHidden="0" w:uiPriority="63" w:unhideWhenUsed="0"/>
-    <w:lsdException w:name="Medium Shading 2 Accent 4" w:semiHidden="0" w:uiPriority="64" w:unhideWhenUsed="0"/>
-    <w:lsdException w:name="Medium List 1 Accent 4" w:semiHidden="0" w:uiPriority="65" w:unhideWhenUsed="0"/>
-    <w:lsdException w:name="Medium List 2 Accent 4" w:semiHidden="0" w:uiPriority="66" w:unhideWhenUsed="0"/>
-    <w:lsdException w:name="Medium Grid 1 Accent 4" w:semiHidden="0" w:uiPriority="67" w:unhideWhenUsed="0"/>
-    <w:lsdException w:name="Medium Grid 2 Accent 4" w:semiHidden="0" w:uiPriority="68" w:unhideWhenUsed="0"/>
-    <w:lsdException w:name="Medium Grid 3 Accent 4" w:semiHidden="0" w:uiPriority="69" w:unhideWhenUsed="0"/>
-    <w:lsdException w:name="Dark List Accent 4" w:semiHidden="0" w:uiPriority="70" w:unhideWhenUsed="0"/>
-    <w:lsdException w:name="Colorful Shading Accent 4" w:semiHidden="0" w:uiPriority="71" w:unhideWhenUsed="0"/>
-    <w:lsdException w:name="Colorful List Accent 4" w:semiHidden="0" w:uiPriority="72" w:unhideWhenUsed="0"/>
-    <w:lsdException w:name="Colorful Grid Accent 4" w:semiHidden="0" w:uiPriority="73" w:unhideWhenUsed="0"/>
-    <w:lsdException w:name="Light Shading Accent 5" w:semiHidden="0" w:uiPriority="60" w:unhideWhenUsed="0"/>
-    <w:lsdException w:name="Light List Accent 5" w:semiHidden="0" w:uiPriority="61" w:unhideWhenUsed="0"/>
-    <w:lsdException w:name="Light Grid Accent 5" w:semiHidden="0" w:uiPriority="62" w:unhideWhenUsed="0"/>
-    <w:lsdException w:name="Medium Shading 1 Accent 5" w:semiHidden="0" w:uiPriority="63" w:unhideWhenUsed="0"/>
-    <w:lsdException w:name="Medium Shading 2 Accent 5" w:semiHidden="0" w:uiPriority="64" w:unhideWhenUsed="0"/>
-    <w:lsdException w:name="Medium List 1 Accent 5" w:semiHidden="0" w:uiPriority="65" w:unhideWhenUsed="0"/>
-    <w:lsdException w:name="Medium List 2 Accent 5" w:semiHidden="0" w:uiPriority="66" w:unhideWhenUsed="0"/>
-    <w:lsdException w:name="Medium Grid 1 Accent 5" w:semiHidden="0" w:uiPriority="67" w:unhideWhenUsed="0"/>
-    <w:lsdException w:name="Medium Grid 2 Accent 5" w:semiHidden="0" w:uiPriority="68" w:unhideWhenUsed="0"/>
-    <w:lsdException w:name="Medium Grid 3 Accent 5" w:semiHidden="0" w:uiPriority="69" w:unhideWhenUsed="0"/>
-    <w:lsdException w:name="Dark List Accent 5" w:semiHidden="0" w:uiPriority="70" w:unhideWhenUsed="0"/>
-    <w:lsdException w:name="Colorful Shading Accent 5" w:semiHidden="0" w:uiPriority="71" w:unhideWhenUsed="0"/>
-    <w:lsdException w:name="Colorful List Accent 5" w:semiHidden="0" w:uiPriority="72" w:unhideWhenUsed="0"/>
-    <w:lsdException w:name="Colorful Grid Accent 5" w:semiHidden="0" w:uiPriority="73" w:unhideWhenUsed="0"/>
-    <w:lsdException w:name="Light Shading Accent 6" w:semiHidden="0" w:uiPriority="60" w:unhideWhenUsed="0"/>
-    <w:lsdException w:name="Light List Accent 6" w:semiHidden="0" w:uiPriority="61" w:unhideWhenUsed="0"/>
-    <w:lsdException w:name="Light Grid Accent 6" w:semiHidden="0" w:uiPriority="62" w:unhideWhenUsed="0"/>
-    <w:lsdException w:name="Medium Shading 1 Accent 6" w:semiHidden="0" w:uiPriority="63" w:unhideWhenUsed="0"/>
-    <w:lsdException w:name="Medium Shading 2 Accent 6" w:semiHidden="0" w:uiPriority="64" w:unhideWhenUsed="0"/>
-    <w:lsdException w:name="Medium List 1 Accent 6" w:semiHidden="0" w:uiPriority="65" w:unhideWhenUsed="0"/>
-    <w:lsdException w:name="Medium List 2 Accent 6" w:semiHidden="0" w:uiPriority="66" w:unhideWhenUsed="0"/>
-    <w:lsdException w:name="Medium Grid 1 Accent 6" w:semiHidden="0" w:uiPriority="67" w:unhideWhenUsed="0"/>
-    <w:lsdException w:name="Medium Grid 2 Accent 6" w:semiHidden="0" w:uiPriority="68" w:unhideWhenUsed="0"/>
-    <w:lsdException w:name="Medium Grid 3 Accent 6" w:semiHidden="0" w:uiPriority="69" w:unhideWhenUsed="0"/>
-    <w:lsdException w:name="Dark List Accent 6" w:semiHidden="0" w:uiPriority="70" w:unhideWhenUsed="0"/>
-    <w:lsdException w:name="Colorful Shading Accent 6" w:semiHidden="0" w:uiPriority="71" w:unhideWhenUsed="0"/>
-    <w:lsdException w:name="Colorful List Accent 6" w:semiHidden="0" w:uiPriority="72" w:unhideWhenUsed="0"/>
-    <w:lsdException w:name="Colorful Grid Accent 6" w:semiHidden="0" w:uiPriority="73" w:unhideWhenUsed="0"/>
-    <w:lsdException w:name="Subtle Emphasis" w:semiHidden="0" w:uiPriority="19" w:unhideWhenUsed="0" w:qFormat="1"/>
-    <w:lsdException w:name="Intense Emphasis" w:semiHidden="0" w:uiPriority="21" w:unhideWhenUsed="0" w:qFormat="1"/>
-    <w:lsdException w:name="Subtle Reference" w:semiHidden="0" w:uiPriority="31" w:unhideWhenUsed="0" w:qFormat="1"/>
-    <w:lsdException w:name="Intense Reference" w:semiHidden="0" w:uiPriority="32" w:unhideWhenUsed="0" w:qFormat="1"/>
-    <w:lsdException w:name="Book Title" w:semiHidden="0" w:uiPriority="33" w:unhideWhenUsed="0" w:qFormat="1"/>
-    <w:lsdException w:name="Bibliography" w:uiPriority="37"/>
-    <w:lsdException w:name="TOC Heading" w:uiPriority="39" w:qFormat="1"/>
-  </w:latentStyles>
-  <w:style w:type="paragraph" w:default="1" w:styleId="a">
-    <w:name w:val="Normal"/>
-    <w:qFormat/>
-  </w:style>
-  <w:style w:type="character" w:default="1" w:styleId="a0">
-    <w:name w:val="Default Paragraph Font"/>
-    <w:uiPriority w:val="1"/>
-    <w:semiHidden/>
-    <w:unhideWhenUsed/>
-  </w:style>
-  <w:style w:type="table" w:default="1" w:styleId="a1">
-    <w:name w:val="Normal Table"/>
-    <w:uiPriority w:val="99"/>
-    <w:semiHidden/>
-    <w:unhideWhenUsed/>
-    <w:tblPr>
-      <w:tblInd w:w="0" w:type="dxa"/>
-      <w:tblCellMar>
-        <w:top w:w="0" w:type="dxa"/>
-        <w:left w:w="108" w:type="dxa"/>
-        <w:bottom w:w="0" w:type="dxa"/>
-        <w:right w:w="108" w:type="dxa"/>
-      </w:tblCellMar>
-    </w:tblPr>
-  </w:style>
-  <w:style w:type="numbering" w:default="1" w:styleId="a2">
-    <w:name w:val="No List"/>
-    <w:uiPriority w:val="99"/>
-    <w:semiHidden/>
-    <w:unhideWhenUsed/>
-  </w:style>
-  <w:style w:type="character" w:styleId="a3">
-    <w:name w:val="Strong"/>
-    <w:basedOn w:val="a0"/>
-    <w:uiPriority w:val="22"/>
-    <w:qFormat/>
-    <w:rsid w:val="00A91322"/>
+  <w:style w:type="paragraph" w:customStyle="1" w:styleId="z1qcye">
+    <w:name w:val="z1qcye"/>
+    <w:basedOn w:val="a"/>
+    <w:rsid w:val="005F1E14"/>
+    <w:pPr>
+      <w:spacing w:before="100" w:beforeAutospacing="1" w:after="100" w:afterAutospacing="1" w:line="240" w:lineRule="auto"/>
+    </w:pPr>
     <w:rPr>
-      <w:b/>
-      <w:bCs/>
-    </w:rPr>
-  </w:style>
-  <w:style w:type="character" w:customStyle="1" w:styleId="inqyif">
-    <w:name w:val="inqyif"/>
-    <w:basedOn w:val="a0"/>
-    <w:rsid w:val="00A91322"/>
-  </w:style>
-  <w:style w:type="character" w:styleId="HTML">
-    <w:name w:val="HTML Code"/>
-    <w:basedOn w:val="a0"/>
-    <w:uiPriority w:val="99"/>
-    <w:semiHidden/>
-    <w:unhideWhenUsed/>
-    <w:rsid w:val="00A91322"/>
-    <w:rPr>
-      <w:rFonts w:ascii="Courier New" w:eastAsia="Times New Roman" w:hAnsi="Courier New" w:cs="Courier New"/>
-      <w:sz w:val="20"/>
-      <w:szCs w:val="20"/>
-    </w:rPr>
-  </w:style>
-  <w:style w:type="character" w:styleId="a4">
-    <w:name w:val="Emphasis"/>
-    <w:basedOn w:val="a0"/>
-    <w:uiPriority w:val="20"/>
-    <w:qFormat/>
-    <w:rsid w:val="00A91322"/>
-    <w:rPr>
-      <w:i/>
-      <w:iCs/>
+      <w:rFonts w:ascii="Times New Roman" w:eastAsia="Times New Roman" w:hAnsi="Times New Roman" w:cs="Times New Roman"/>
+      <w:sz w:val="24"/>
+      <w:szCs w:val="24"/>
+      <w:lang w:val="uk-UA" w:eastAsia="uk-UA"/>
     </w:rPr>
   </w:style>
 </w:styles>

</xml_diff>